<commit_message>
fix: export Teky JSON into project directory
</commit_message>
<xml_diff>
--- a/docs/SCORM_Editor_Huong_Dan_Chi_Tiet.docx
+++ b/docs/SCORM_Editor_Huong_Dan_Chi_Tiet.docx
@@ -1559,7 +1559,7 @@
                 <w:sz w:val="18"/>
                 <w:szCs w:val="18"/>
               </w:rPr>
-              <w:t xml:space="preserve">Cover, ảnh câu hỏi, ảnh đáp án, audio/video</w:t>
+              <w:t xml:space="preserve">Cover, ảnh câu hỏi và ảnh đáp án</w:t>
             </w:r>
           </w:p>
         </w:tc>
@@ -2773,7 +2773,40 @@
           <w:sz w:val="25"/>
           <w:szCs w:val="25"/>
         </w:rPr>
-        <w:t xml:space="preserve">4.1. Gói import khuyến nghị</w:t>
+        <w:t xml:space="preserve">4.1. Cấu trúc nguồn của một bài học</w:t>
+      </w:r>
+    </w:p>
+    <w:p>
+      <w:pPr>
+        <w:spacing w:after="100" w:line="280" w:lineRule="auto"/>
+      </w:pPr>
+      <w:r>
+        <w:rPr>
+          <w:rFonts w:ascii="Calibri" w:cs="Calibri" w:eastAsia="Calibri" w:hAnsi="Calibri"/>
+          <w:color w:val="202124"/>
+          <w:sz w:val="20"/>
+          <w:szCs w:val="20"/>
+        </w:rPr>
+        <w:t xml:space="preserve">Mỗi bài học phải có một thư mục riêng. File Excel và thư mục </w:t>
+      </w:r>
+      <w:r>
+        <w:rPr>
+          <w:rFonts w:ascii="Courier New" w:cs="Courier New" w:eastAsia="Courier New" w:hAnsi="Courier New"/>
+          <w:color w:val="1F4D78"/>
+          <w:sz w:val="18"/>
+          <w:szCs w:val="18"/>
+          <w:shd w:fill="EEF2F6" w:color="auto" w:val="clear"/>
+        </w:rPr>
+        <w:t xml:space="preserve">media</w:t>
+      </w:r>
+      <w:r>
+        <w:rPr>
+          <w:rFonts w:ascii="Calibri" w:cs="Calibri" w:eastAsia="Calibri" w:hAnsi="Calibri"/>
+          <w:color w:val="202124"/>
+          <w:sz w:val="20"/>
+          <w:szCs w:val="20"/>
+        </w:rPr>
+        <w:t xml:space="preserve"> nằm cùng cấp:</w:t>
       </w:r>
     </w:p>
     <w:p>
@@ -2795,7 +2828,7 @@
           <w:sz w:val="18"/>
           <w:szCs w:val="18"/>
         </w:rPr>
-        <w:t xml:space="preserve">Ten_quiz.zip</w:t>
+        <w:t xml:space="preserve">Quiz_Teky/</w:t>
       </w:r>
       <w:r>
         <w:rPr>
@@ -2805,7 +2838,7 @@
           <w:szCs w:val="18"/>
         </w:rPr>
         <w:br/>
-        <w:t xml:space="preserve">├── Ten_quiz.xlsx</w:t>
+        <w:t xml:space="preserve">├── quiz_teky.xlsx</w:t>
       </w:r>
       <w:r>
         <w:rPr>
@@ -2835,7 +2868,7 @@
           <w:szCs w:val="18"/>
         </w:rPr>
         <w:br/>
-        <w:t xml:space="preserve">    ├── q01_question.jpg</w:t>
+        <w:t xml:space="preserve">    ├── question_01.jpg</w:t>
       </w:r>
       <w:r>
         <w:rPr>
@@ -2845,7 +2878,43 @@
           <w:szCs w:val="18"/>
         </w:rPr>
         <w:br/>
-        <w:t xml:space="preserve">    ├── q01_answer_a.png</w:t>
+        <w:t xml:space="preserve">    └── answer_01_a.jpg</w:t>
+      </w:r>
+    </w:p>
+    <w:p>
+      <w:pPr>
+        <w:spacing w:after="100" w:line="280" w:lineRule="auto"/>
+      </w:pPr>
+      <w:r>
+        <w:rPr>
+          <w:rFonts w:ascii="Calibri" w:cs="Calibri" w:eastAsia="Calibri" w:hAnsi="Calibri"/>
+          <w:color w:val="202124"/>
+          <w:sz w:val="20"/>
+          <w:szCs w:val="20"/>
+        </w:rPr>
+        <w:t xml:space="preserve">Trong Excel, mọi ảnh dùng đường dẫn tương đối tính từ vị trí file Excel:</w:t>
+      </w:r>
+    </w:p>
+    <w:p>
+      <w:pPr>
+        <w:pBdr>
+          <w:top w:val="single" w:color="C8D2DF" w:sz="4"/>
+          <w:bottom w:val="single" w:color="C8D2DF" w:sz="4"/>
+          <w:left w:val="single" w:color="C8D2DF" w:sz="4"/>
+          <w:right w:val="single" w:color="C8D2DF" w:sz="4"/>
+        </w:pBdr>
+        <w:shd w:fill="F4F6F9" w:color="auto" w:val="clear"/>
+        <w:spacing w:after="160" w:before="100" w:line="260" w:lineRule="auto"/>
+        <w:ind w:left="220" w:right="220"/>
+      </w:pPr>
+      <w:r>
+        <w:rPr>
+          <w:rFonts w:ascii="Courier New" w:cs="Courier New" w:eastAsia="Courier New" w:hAnsi="Courier New"/>
+          <w:color w:val="1F4D78"/>
+          <w:sz w:val="18"/>
+          <w:szCs w:val="18"/>
+        </w:rPr>
+        <w:t xml:space="preserve">media/quiz_cover.jpg</w:t>
       </w:r>
       <w:r>
         <w:rPr>
@@ -2855,7 +2924,7 @@
           <w:szCs w:val="18"/>
         </w:rPr>
         <w:br/>
-        <w:t xml:space="preserve">    ├── q04_left_01.jpg</w:t>
+        <w:t xml:space="preserve">media/question_01.jpg</w:t>
       </w:r>
       <w:r>
         <w:rPr>
@@ -2865,41 +2934,26 @@
           <w:szCs w:val="18"/>
         </w:rPr>
         <w:br/>
-        <w:t xml:space="preserve">    ├── q04_right_01.jpg</w:t>
-      </w:r>
-      <w:r>
-        <w:rPr>
-          <w:rFonts w:ascii="Courier New" w:cs="Courier New" w:eastAsia="Courier New" w:hAnsi="Courier New"/>
-          <w:color w:val="1F4D78"/>
-          <w:sz w:val="18"/>
-          <w:szCs w:val="18"/>
-        </w:rPr>
-        <w:br/>
-        <w:t xml:space="preserve">    ├── voice_question.mp3</w:t>
-      </w:r>
-      <w:r>
-        <w:rPr>
-          <w:rFonts w:ascii="Courier New" w:cs="Courier New" w:eastAsia="Courier New" w:hAnsi="Courier New"/>
-          <w:color w:val="1F4D78"/>
-          <w:sz w:val="18"/>
-          <w:szCs w:val="18"/>
-        </w:rPr>
-        <w:br/>
-        <w:t xml:space="preserve">    └── sample_lesson.mp4</w:t>
-      </w:r>
-    </w:p>
-    <w:p>
-      <w:pPr>
-        <w:spacing w:after="100" w:line="280" w:lineRule="auto"/>
-      </w:pPr>
-      <w:r>
-        <w:rPr>
-          <w:rFonts w:ascii="Calibri" w:cs="Calibri" w:eastAsia="Calibri" w:hAnsi="Calibri"/>
-          <w:color w:val="202124"/>
-          <w:sz w:val="20"/>
-          <w:szCs w:val="20"/>
-        </w:rPr>
-        <w:t xml:space="preserve">File Excel và thư mục </w:t>
+        <w:t xml:space="preserve">media/answer_01_a.jpg</w:t>
+      </w:r>
+    </w:p>
+    <w:p>
+      <w:pPr>
+        <w:pStyle w:val="ListParagraph"/>
+        <w:numPr>
+          <w:ilvl w:val="0"/>
+          <w:numId w:val="2"/>
+        </w:numPr>
+        <w:spacing w:after="60" w:line="280" w:lineRule="auto"/>
+      </w:pPr>
+      <w:r>
+        <w:rPr>
+          <w:rFonts w:ascii="Calibri" w:cs="Calibri" w:eastAsia="Calibri" w:hAnsi="Calibri"/>
+          <w:color w:val="202124"/>
+          <w:sz w:val="20"/>
+          <w:szCs w:val="20"/>
+        </w:rPr>
+        <w:t xml:space="preserve">Ảnh đại diện toàn quiz được khai báo tại </w:t>
       </w:r>
       <w:r>
         <w:rPr>
@@ -2909,30 +2963,35 @@
           <w:szCs w:val="18"/>
           <w:shd w:fill="EEF2F6" w:color="auto" w:val="clear"/>
         </w:rPr>
-        <w:t xml:space="preserve">media</w:t>
-      </w:r>
-      <w:r>
-        <w:rPr>
-          <w:rFonts w:ascii="Calibri" w:cs="Calibri" w:eastAsia="Calibri" w:hAnsi="Calibri"/>
-          <w:color w:val="202124"/>
-          <w:sz w:val="20"/>
-          <w:szCs w:val="20"/>
-        </w:rPr>
-        <w:t xml:space="preserve"> phải cùng cấp trong file zip. Đây là cách ổn định nhất khi chuyển gói nội dung sang máy khác.</w:t>
-      </w:r>
-    </w:p>
-    <w:p>
-      <w:pPr>
-        <w:spacing w:after="100" w:line="280" w:lineRule="auto"/>
-      </w:pPr>
-      <w:r>
-        <w:rPr>
-          <w:rFonts w:ascii="Calibri" w:cs="Calibri" w:eastAsia="Calibri" w:hAnsi="Calibri"/>
-          <w:color w:val="202124"/>
-          <w:sz w:val="20"/>
-          <w:szCs w:val="20"/>
-        </w:rPr>
-        <w:t xml:space="preserve">Có thể import riêng </w:t>
+        <w:t xml:space="preserve">Quiz Settings.coverImage</w:t>
+      </w:r>
+      <w:r>
+        <w:rPr>
+          <w:rFonts w:ascii="Calibri" w:cs="Calibri" w:eastAsia="Calibri" w:hAnsi="Calibri"/>
+          <w:color w:val="202124"/>
+          <w:sz w:val="20"/>
+          <w:szCs w:val="20"/>
+        </w:rPr>
+        <w:t xml:space="preserve">.</w:t>
+      </w:r>
+    </w:p>
+    <w:p>
+      <w:pPr>
+        <w:pStyle w:val="ListParagraph"/>
+        <w:numPr>
+          <w:ilvl w:val="0"/>
+          <w:numId w:val="2"/>
+        </w:numPr>
+        <w:spacing w:after="60" w:line="280" w:lineRule="auto"/>
+      </w:pPr>
+      <w:r>
+        <w:rPr>
+          <w:rFonts w:ascii="Calibri" w:cs="Calibri" w:eastAsia="Calibri" w:hAnsi="Calibri"/>
+          <w:color w:val="202124"/>
+          <w:sz w:val="20"/>
+          <w:szCs w:val="20"/>
+        </w:rPr>
+        <w:t xml:space="preserve">Ảnh nội dung câu hỏi được khai báo tại cột </w:t>
       </w:r>
       <w:r>
         <w:rPr>
@@ -2942,16 +3001,35 @@
           <w:szCs w:val="18"/>
           <w:shd w:fill="EEF2F6" w:color="auto" w:val="clear"/>
         </w:rPr>
-        <w:t xml:space="preserve">.xlsx</w:t>
-      </w:r>
-      <w:r>
-        <w:rPr>
-          <w:rFonts w:ascii="Calibri" w:cs="Calibri" w:eastAsia="Calibri" w:hAnsi="Calibri"/>
-          <w:color w:val="202124"/>
-          <w:sz w:val="20"/>
-          <w:szCs w:val="20"/>
-        </w:rPr>
-        <w:t xml:space="preserve"> nếu media đã nằm trong bộ template của dự án, nhưng với quiz thực tế luôn nên dùng </w:t>
+        <w:t xml:space="preserve">Image</w:t>
+      </w:r>
+      <w:r>
+        <w:rPr>
+          <w:rFonts w:ascii="Calibri" w:cs="Calibri" w:eastAsia="Calibri" w:hAnsi="Calibri"/>
+          <w:color w:val="202124"/>
+          <w:sz w:val="20"/>
+          <w:szCs w:val="20"/>
+        </w:rPr>
+        <w:t xml:space="preserve">.</w:t>
+      </w:r>
+    </w:p>
+    <w:p>
+      <w:pPr>
+        <w:pStyle w:val="ListParagraph"/>
+        <w:numPr>
+          <w:ilvl w:val="0"/>
+          <w:numId w:val="2"/>
+        </w:numPr>
+        <w:spacing w:after="60" w:line="280" w:lineRule="auto"/>
+      </w:pPr>
+      <w:r>
+        <w:rPr>
+          <w:rFonts w:ascii="Calibri" w:cs="Calibri" w:eastAsia="Calibri" w:hAnsi="Calibri"/>
+          <w:color w:val="202124"/>
+          <w:sz w:val="20"/>
+          <w:szCs w:val="20"/>
+        </w:rPr>
+        <w:t xml:space="preserve">Ảnh lựa chọn dùng </w:t>
       </w:r>
       <w:r>
         <w:rPr>
@@ -2961,16 +3039,111 @@
           <w:szCs w:val="18"/>
           <w:shd w:fill="EEF2F6" w:color="auto" w:val="clear"/>
         </w:rPr>
-        <w:t xml:space="preserve">.zip</w:t>
-      </w:r>
-      <w:r>
-        <w:rPr>
-          <w:rFonts w:ascii="Calibri" w:cs="Calibri" w:eastAsia="Calibri" w:hAnsi="Calibri"/>
-          <w:color w:val="202124"/>
-          <w:sz w:val="20"/>
-          <w:szCs w:val="20"/>
-        </w:rPr>
-        <w:t xml:space="preserve"> gồm Excel + media.</w:t>
+        <w:t xml:space="preserve">Answer N Image</w:t>
+      </w:r>
+      <w:r>
+        <w:rPr>
+          <w:rFonts w:ascii="Calibri" w:cs="Calibri" w:eastAsia="Calibri" w:hAnsi="Calibri"/>
+          <w:color w:val="202124"/>
+          <w:sz w:val="20"/>
+          <w:szCs w:val="20"/>
+        </w:rPr>
+        <w:t xml:space="preserve">.</w:t>
+      </w:r>
+    </w:p>
+    <w:p>
+      <w:pPr>
+        <w:pStyle w:val="ListParagraph"/>
+        <w:numPr>
+          <w:ilvl w:val="0"/>
+          <w:numId w:val="2"/>
+        </w:numPr>
+        <w:spacing w:after="60" w:line="280" w:lineRule="auto"/>
+      </w:pPr>
+      <w:r>
+        <w:rPr>
+          <w:rFonts w:ascii="Calibri" w:cs="Calibri" w:eastAsia="Calibri" w:hAnsi="Calibri"/>
+          <w:color w:val="202124"/>
+          <w:sz w:val="20"/>
+          <w:szCs w:val="20"/>
+        </w:rPr>
+        <w:t xml:space="preserve">Matching dùng </w:t>
+      </w:r>
+      <w:r>
+        <w:rPr>
+          <w:rFonts w:ascii="Courier New" w:cs="Courier New" w:eastAsia="Courier New" w:hAnsi="Courier New"/>
+          <w:color w:val="1F4D78"/>
+          <w:sz w:val="18"/>
+          <w:szCs w:val="18"/>
+          <w:shd w:fill="EEF2F6" w:color="auto" w:val="clear"/>
+        </w:rPr>
+        <w:t xml:space="preserve">Answer N Left Image</w:t>
+      </w:r>
+      <w:r>
+        <w:rPr>
+          <w:rFonts w:ascii="Calibri" w:cs="Calibri" w:eastAsia="Calibri" w:hAnsi="Calibri"/>
+          <w:color w:val="202124"/>
+          <w:sz w:val="20"/>
+          <w:szCs w:val="20"/>
+        </w:rPr>
+        <w:t xml:space="preserve"> và </w:t>
+      </w:r>
+      <w:r>
+        <w:rPr>
+          <w:rFonts w:ascii="Courier New" w:cs="Courier New" w:eastAsia="Courier New" w:hAnsi="Courier New"/>
+          <w:color w:val="1F4D78"/>
+          <w:sz w:val="18"/>
+          <w:szCs w:val="18"/>
+          <w:shd w:fill="EEF2F6" w:color="auto" w:val="clear"/>
+        </w:rPr>
+        <w:t xml:space="preserve">Answer N Right Image</w:t>
+      </w:r>
+      <w:r>
+        <w:rPr>
+          <w:rFonts w:ascii="Calibri" w:cs="Calibri" w:eastAsia="Calibri" w:hAnsi="Calibri"/>
+          <w:color w:val="202124"/>
+          <w:sz w:val="20"/>
+          <w:szCs w:val="20"/>
+        </w:rPr>
+        <w:t xml:space="preserve">.</w:t>
+      </w:r>
+    </w:p>
+    <w:p>
+      <w:pPr>
+        <w:pStyle w:val="ListParagraph"/>
+        <w:numPr>
+          <w:ilvl w:val="0"/>
+          <w:numId w:val="2"/>
+        </w:numPr>
+        <w:spacing w:after="60" w:line="280" w:lineRule="auto"/>
+      </w:pPr>
+      <w:r>
+        <w:rPr>
+          <w:rFonts w:ascii="Calibri" w:cs="Calibri" w:eastAsia="Calibri" w:hAnsi="Calibri"/>
+          <w:color w:val="202124"/>
+          <w:sz w:val="20"/>
+          <w:szCs w:val="20"/>
+        </w:rPr>
+        <w:t xml:space="preserve">Video chỉ nhập URL YouTube/Vimeo; Audio chỉ nhập URL HTTPS. Không đặt file video/audio trong </w:t>
+      </w:r>
+      <w:r>
+        <w:rPr>
+          <w:rFonts w:ascii="Courier New" w:cs="Courier New" w:eastAsia="Courier New" w:hAnsi="Courier New"/>
+          <w:color w:val="1F4D78"/>
+          <w:sz w:val="18"/>
+          <w:szCs w:val="18"/>
+          <w:shd w:fill="EEF2F6" w:color="auto" w:val="clear"/>
+        </w:rPr>
+        <w:t xml:space="preserve">media/</w:t>
+      </w:r>
+      <w:r>
+        <w:rPr>
+          <w:rFonts w:ascii="Calibri" w:cs="Calibri" w:eastAsia="Calibri" w:hAnsi="Calibri"/>
+          <w:color w:val="202124"/>
+          <w:sz w:val="20"/>
+          <w:szCs w:val="20"/>
+        </w:rPr>
+        <w:t xml:space="preserve">.</w:t>
       </w:r>
     </w:p>
     <w:p>
@@ -2988,7 +3161,882 @@
           <w:sz w:val="25"/>
           <w:szCs w:val="25"/>
         </w:rPr>
-        <w:t xml:space="preserve">4.2. Quy trình</w:t>
+        <w:t xml:space="preserve">4.2. Import trên web/deploy: luôn dùng ZIP</w:t>
+      </w:r>
+    </w:p>
+    <w:p>
+      <w:pPr>
+        <w:spacing w:after="100" w:line="280" w:lineRule="auto"/>
+      </w:pPr>
+      <w:r>
+        <w:rPr>
+          <w:rFonts w:ascii="Calibri" w:cs="Calibri" w:eastAsia="Calibri" w:hAnsi="Calibri"/>
+          <w:color w:val="202124"/>
+          <w:sz w:val="20"/>
+          <w:szCs w:val="20"/>
+        </w:rPr>
+        <w:t xml:space="preserve">Khi chọn một file Excel trong trình duyệt, trình duyệt chỉ gửi chính file Excel; thư mục </w:t>
+      </w:r>
+      <w:r>
+        <w:rPr>
+          <w:rFonts w:ascii="Courier New" w:cs="Courier New" w:eastAsia="Courier New" w:hAnsi="Courier New"/>
+          <w:color w:val="1F4D78"/>
+          <w:sz w:val="18"/>
+          <w:szCs w:val="18"/>
+          <w:shd w:fill="EEF2F6" w:color="auto" w:val="clear"/>
+        </w:rPr>
+        <w:t xml:space="preserve">media</w:t>
+      </w:r>
+      <w:r>
+        <w:rPr>
+          <w:rFonts w:ascii="Calibri" w:cs="Calibri" w:eastAsia="Calibri" w:hAnsi="Calibri"/>
+          <w:color w:val="202124"/>
+          <w:sz w:val="20"/>
+          <w:szCs w:val="20"/>
+        </w:rPr>
+        <w:t xml:space="preserve"> cùng cấp trên máy người dùng không được gửi lên server. Vì vậy, với web deploy phải nén Excel và </w:t>
+      </w:r>
+      <w:r>
+        <w:rPr>
+          <w:rFonts w:ascii="Courier New" w:cs="Courier New" w:eastAsia="Courier New" w:hAnsi="Courier New"/>
+          <w:color w:val="1F4D78"/>
+          <w:sz w:val="18"/>
+          <w:szCs w:val="18"/>
+          <w:shd w:fill="EEF2F6" w:color="auto" w:val="clear"/>
+        </w:rPr>
+        <w:t xml:space="preserve">media</w:t>
+      </w:r>
+      <w:r>
+        <w:rPr>
+          <w:rFonts w:ascii="Calibri" w:cs="Calibri" w:eastAsia="Calibri" w:hAnsi="Calibri"/>
+          <w:color w:val="202124"/>
+          <w:sz w:val="20"/>
+          <w:szCs w:val="20"/>
+        </w:rPr>
+        <w:t xml:space="preserve"> thành một gói:</w:t>
+      </w:r>
+    </w:p>
+    <w:p>
+      <w:pPr>
+        <w:pBdr>
+          <w:top w:val="single" w:color="C8D2DF" w:sz="4"/>
+          <w:bottom w:val="single" w:color="C8D2DF" w:sz="4"/>
+          <w:left w:val="single" w:color="C8D2DF" w:sz="4"/>
+          <w:right w:val="single" w:color="C8D2DF" w:sz="4"/>
+        </w:pBdr>
+        <w:shd w:fill="F4F6F9" w:color="auto" w:val="clear"/>
+        <w:spacing w:after="160" w:before="100" w:line="260" w:lineRule="auto"/>
+        <w:ind w:left="220" w:right="220"/>
+      </w:pPr>
+      <w:r>
+        <w:rPr>
+          <w:rFonts w:ascii="Courier New" w:cs="Courier New" w:eastAsia="Courier New" w:hAnsi="Courier New"/>
+          <w:color w:val="1F4D78"/>
+          <w:sz w:val="18"/>
+          <w:szCs w:val="18"/>
+        </w:rPr>
+        <w:t xml:space="preserve">Quiz_Teky.zip</w:t>
+      </w:r>
+      <w:r>
+        <w:rPr>
+          <w:rFonts w:ascii="Courier New" w:cs="Courier New" w:eastAsia="Courier New" w:hAnsi="Courier New"/>
+          <w:color w:val="1F4D78"/>
+          <w:sz w:val="18"/>
+          <w:szCs w:val="18"/>
+        </w:rPr>
+        <w:br/>
+        <w:t xml:space="preserve">├── quiz_teky.xlsx</w:t>
+      </w:r>
+      <w:r>
+        <w:rPr>
+          <w:rFonts w:ascii="Courier New" w:cs="Courier New" w:eastAsia="Courier New" w:hAnsi="Courier New"/>
+          <w:color w:val="1F4D78"/>
+          <w:sz w:val="18"/>
+          <w:szCs w:val="18"/>
+        </w:rPr>
+        <w:br/>
+        <w:t xml:space="preserve">└── media/</w:t>
+      </w:r>
+      <w:r>
+        <w:rPr>
+          <w:rFonts w:ascii="Courier New" w:cs="Courier New" w:eastAsia="Courier New" w:hAnsi="Courier New"/>
+          <w:color w:val="1F4D78"/>
+          <w:sz w:val="18"/>
+          <w:szCs w:val="18"/>
+        </w:rPr>
+        <w:br/>
+        <w:t xml:space="preserve">    ├── quiz_cover.jpg</w:t>
+      </w:r>
+      <w:r>
+        <w:rPr>
+          <w:rFonts w:ascii="Courier New" w:cs="Courier New" w:eastAsia="Courier New" w:hAnsi="Courier New"/>
+          <w:color w:val="1F4D78"/>
+          <w:sz w:val="18"/>
+          <w:szCs w:val="18"/>
+        </w:rPr>
+        <w:br/>
+        <w:t xml:space="preserve">    ├── question_01.jpg</w:t>
+      </w:r>
+      <w:r>
+        <w:rPr>
+          <w:rFonts w:ascii="Courier New" w:cs="Courier New" w:eastAsia="Courier New" w:hAnsi="Courier New"/>
+          <w:color w:val="1F4D78"/>
+          <w:sz w:val="18"/>
+          <w:szCs w:val="18"/>
+        </w:rPr>
+        <w:br/>
+        <w:t xml:space="preserve">    └── answer_01_a.jpg</w:t>
+      </w:r>
+    </w:p>
+    <w:p>
+      <w:pPr>
+        <w:spacing w:after="100" w:line="280" w:lineRule="auto"/>
+      </w:pPr>
+      <w:r>
+        <w:rPr>
+          <w:rFonts w:ascii="Calibri" w:cs="Calibri" w:eastAsia="Calibri" w:hAnsi="Calibri"/>
+          <w:color w:val="202124"/>
+          <w:sz w:val="20"/>
+          <w:szCs w:val="20"/>
+        </w:rPr>
+        <w:t xml:space="preserve">File Excel và </w:t>
+      </w:r>
+      <w:r>
+        <w:rPr>
+          <w:rFonts w:ascii="Courier New" w:cs="Courier New" w:eastAsia="Courier New" w:hAnsi="Courier New"/>
+          <w:color w:val="1F4D78"/>
+          <w:sz w:val="18"/>
+          <w:szCs w:val="18"/>
+          <w:shd w:fill="EEF2F6" w:color="auto" w:val="clear"/>
+        </w:rPr>
+        <w:t xml:space="preserve">media/</w:t>
+      </w:r>
+      <w:r>
+        <w:rPr>
+          <w:rFonts w:ascii="Calibri" w:cs="Calibri" w:eastAsia="Calibri" w:hAnsi="Calibri"/>
+          <w:color w:val="202124"/>
+          <w:sz w:val="20"/>
+          <w:szCs w:val="20"/>
+        </w:rPr>
+        <w:t xml:space="preserve"> phải cùng cấp trong ZIP. Đây cũng là cách ổn định nhất khi chuyển nội dung giữa các máy hoặc bàn giao cho người khác.</w:t>
+      </w:r>
+    </w:p>
+    <w:p>
+      <w:pPr>
+        <w:pStyle w:val="Heading2"/>
+        <w:keepNext/>
+        <w:spacing w:after="140" w:before="280"/>
+      </w:pPr>
+      <w:r>
+        <w:rPr>
+          <w:rFonts w:ascii="Calibri" w:cs="Calibri" w:eastAsia="Calibri" w:hAnsi="Calibri"/>
+          <w:b/>
+          <w:bCs/>
+          <w:color w:val="2E74B5"/>
+          <w:sz w:val="25"/>
+          <w:szCs w:val="25"/>
+        </w:rPr>
+        <w:t xml:space="preserve">4.3. Import riêng Excel khi chạy local</w:t>
+      </w:r>
+    </w:p>
+    <w:p>
+      <w:pPr>
+        <w:spacing w:after="100" w:line="280" w:lineRule="auto"/>
+      </w:pPr>
+      <w:r>
+        <w:rPr>
+          <w:rFonts w:ascii="Calibri" w:cs="Calibri" w:eastAsia="Calibri" w:hAnsi="Calibri"/>
+          <w:color w:val="202124"/>
+          <w:sz w:val="20"/>
+          <w:szCs w:val="20"/>
+        </w:rPr>
+        <w:t xml:space="preserve">Chỉ import riêng </w:t>
+      </w:r>
+      <w:r>
+        <w:rPr>
+          <w:rFonts w:ascii="Courier New" w:cs="Courier New" w:eastAsia="Courier New" w:hAnsi="Courier New"/>
+          <w:color w:val="1F4D78"/>
+          <w:sz w:val="18"/>
+          <w:szCs w:val="18"/>
+          <w:shd w:fill="EEF2F6" w:color="auto" w:val="clear"/>
+        </w:rPr>
+        <w:t xml:space="preserve">.xlsx</w:t>
+      </w:r>
+      <w:r>
+        <w:rPr>
+          <w:rFonts w:ascii="Calibri" w:cs="Calibri" w:eastAsia="Calibri" w:hAnsi="Calibri"/>
+          <w:color w:val="202124"/>
+          <w:sz w:val="20"/>
+          <w:szCs w:val="20"/>
+        </w:rPr>
+        <w:t xml:space="preserve"> khi toàn bộ nguồn bài học đã nằm trong </w:t>
+      </w:r>
+      <w:r>
+        <w:rPr>
+          <w:rFonts w:ascii="Courier New" w:cs="Courier New" w:eastAsia="Courier New" w:hAnsi="Courier New"/>
+          <w:color w:val="1F4D78"/>
+          <w:sz w:val="18"/>
+          <w:szCs w:val="18"/>
+          <w:shd w:fill="EEF2F6" w:color="auto" w:val="clear"/>
+        </w:rPr>
+        <w:t xml:space="preserve">SCORM-PROJECT/ImportTemplate</w:t>
+      </w:r>
+      <w:r>
+        <w:rPr>
+          <w:rFonts w:ascii="Calibri" w:cs="Calibri" w:eastAsia="Calibri" w:hAnsi="Calibri"/>
+          <w:color w:val="202124"/>
+          <w:sz w:val="20"/>
+          <w:szCs w:val="20"/>
+        </w:rPr>
+        <w:t xml:space="preserve">:</w:t>
+      </w:r>
+    </w:p>
+    <w:p>
+      <w:pPr>
+        <w:pBdr>
+          <w:top w:val="single" w:color="C8D2DF" w:sz="4"/>
+          <w:bottom w:val="single" w:color="C8D2DF" w:sz="4"/>
+          <w:left w:val="single" w:color="C8D2DF" w:sz="4"/>
+          <w:right w:val="single" w:color="C8D2DF" w:sz="4"/>
+        </w:pBdr>
+        <w:shd w:fill="F4F6F9" w:color="auto" w:val="clear"/>
+        <w:spacing w:after="160" w:before="100" w:line="260" w:lineRule="auto"/>
+        <w:ind w:left="220" w:right="220"/>
+      </w:pPr>
+      <w:r>
+        <w:rPr>
+          <w:rFonts w:ascii="Courier New" w:cs="Courier New" w:eastAsia="Courier New" w:hAnsi="Courier New"/>
+          <w:color w:val="1F4D78"/>
+          <w:sz w:val="18"/>
+          <w:szCs w:val="18"/>
+        </w:rPr>
+        <w:t xml:space="preserve">SCORM-PROJECT/</w:t>
+      </w:r>
+      <w:r>
+        <w:rPr>
+          <w:rFonts w:ascii="Courier New" w:cs="Courier New" w:eastAsia="Courier New" w:hAnsi="Courier New"/>
+          <w:color w:val="1F4D78"/>
+          <w:sz w:val="18"/>
+          <w:szCs w:val="18"/>
+        </w:rPr>
+        <w:br/>
+        <w:t xml:space="preserve">└── ImportTemplate/</w:t>
+      </w:r>
+      <w:r>
+        <w:rPr>
+          <w:rFonts w:ascii="Courier New" w:cs="Courier New" w:eastAsia="Courier New" w:hAnsi="Courier New"/>
+          <w:color w:val="1F4D78"/>
+          <w:sz w:val="18"/>
+          <w:szCs w:val="18"/>
+        </w:rPr>
+        <w:br/>
+        <w:t xml:space="preserve">    ├── SNLT-HP01-B01/</w:t>
+      </w:r>
+      <w:r>
+        <w:rPr>
+          <w:rFonts w:ascii="Courier New" w:cs="Courier New" w:eastAsia="Courier New" w:hAnsi="Courier New"/>
+          <w:color w:val="1F4D78"/>
+          <w:sz w:val="18"/>
+          <w:szCs w:val="18"/>
+        </w:rPr>
+        <w:br/>
+        <w:t xml:space="preserve">    │   ├── SNLT-HP01-B01.xlsx</w:t>
+      </w:r>
+      <w:r>
+        <w:rPr>
+          <w:rFonts w:ascii="Courier New" w:cs="Courier New" w:eastAsia="Courier New" w:hAnsi="Courier New"/>
+          <w:color w:val="1F4D78"/>
+          <w:sz w:val="18"/>
+          <w:szCs w:val="18"/>
+        </w:rPr>
+        <w:br/>
+        <w:t xml:space="preserve">    │   └── media/</w:t>
+      </w:r>
+      <w:r>
+        <w:rPr>
+          <w:rFonts w:ascii="Courier New" w:cs="Courier New" w:eastAsia="Courier New" w:hAnsi="Courier New"/>
+          <w:color w:val="1F4D78"/>
+          <w:sz w:val="18"/>
+          <w:szCs w:val="18"/>
+        </w:rPr>
+        <w:br/>
+        <w:t xml:space="preserve">    │       └── quiz_cover.jpg</w:t>
+      </w:r>
+      <w:r>
+        <w:rPr>
+          <w:rFonts w:ascii="Courier New" w:cs="Courier New" w:eastAsia="Courier New" w:hAnsi="Courier New"/>
+          <w:color w:val="1F4D78"/>
+          <w:sz w:val="18"/>
+          <w:szCs w:val="18"/>
+        </w:rPr>
+        <w:br/>
+        <w:t xml:space="preserve">    ├── SNLT-HP01-B02/</w:t>
+      </w:r>
+      <w:r>
+        <w:rPr>
+          <w:rFonts w:ascii="Courier New" w:cs="Courier New" w:eastAsia="Courier New" w:hAnsi="Courier New"/>
+          <w:color w:val="1F4D78"/>
+          <w:sz w:val="18"/>
+          <w:szCs w:val="18"/>
+        </w:rPr>
+        <w:br/>
+        <w:t xml:space="preserve">    │   ├── SNLT-HP01-B02.xlsx</w:t>
+      </w:r>
+      <w:r>
+        <w:rPr>
+          <w:rFonts w:ascii="Courier New" w:cs="Courier New" w:eastAsia="Courier New" w:hAnsi="Courier New"/>
+          <w:color w:val="1F4D78"/>
+          <w:sz w:val="18"/>
+          <w:szCs w:val="18"/>
+        </w:rPr>
+        <w:br/>
+        <w:t xml:space="preserve">    │   └── media/</w:t>
+      </w:r>
+      <w:r>
+        <w:rPr>
+          <w:rFonts w:ascii="Courier New" w:cs="Courier New" w:eastAsia="Courier New" w:hAnsi="Courier New"/>
+          <w:color w:val="1F4D78"/>
+          <w:sz w:val="18"/>
+          <w:szCs w:val="18"/>
+        </w:rPr>
+        <w:br/>
+        <w:t xml:space="preserve">    │       └── quiz_cover.jpg</w:t>
+      </w:r>
+      <w:r>
+        <w:rPr>
+          <w:rFonts w:ascii="Courier New" w:cs="Courier New" w:eastAsia="Courier New" w:hAnsi="Courier New"/>
+          <w:color w:val="1F4D78"/>
+          <w:sz w:val="18"/>
+          <w:szCs w:val="18"/>
+        </w:rPr>
+        <w:br/>
+        <w:t xml:space="preserve">    └── SNLT-HP02-B01/</w:t>
+      </w:r>
+      <w:r>
+        <w:rPr>
+          <w:rFonts w:ascii="Courier New" w:cs="Courier New" w:eastAsia="Courier New" w:hAnsi="Courier New"/>
+          <w:color w:val="1F4D78"/>
+          <w:sz w:val="18"/>
+          <w:szCs w:val="18"/>
+        </w:rPr>
+        <w:br/>
+        <w:t xml:space="preserve">        ├── SNLT-HP02-B01.xlsx</w:t>
+      </w:r>
+      <w:r>
+        <w:rPr>
+          <w:rFonts w:ascii="Courier New" w:cs="Courier New" w:eastAsia="Courier New" w:hAnsi="Courier New"/>
+          <w:color w:val="1F4D78"/>
+          <w:sz w:val="18"/>
+          <w:szCs w:val="18"/>
+        </w:rPr>
+        <w:br/>
+        <w:t xml:space="preserve">        └── media/</w:t>
+      </w:r>
+      <w:r>
+        <w:rPr>
+          <w:rFonts w:ascii="Courier New" w:cs="Courier New" w:eastAsia="Courier New" w:hAnsi="Courier New"/>
+          <w:color w:val="1F4D78"/>
+          <w:sz w:val="18"/>
+          <w:szCs w:val="18"/>
+        </w:rPr>
+        <w:br/>
+        <w:t xml:space="preserve">            └── quiz_cover.jpg</w:t>
+      </w:r>
+    </w:p>
+    <w:p>
+      <w:pPr>
+        <w:spacing w:after="100" w:line="280" w:lineRule="auto"/>
+      </w:pPr>
+      <w:r>
+        <w:rPr>
+          <w:rFonts w:ascii="Calibri" w:cs="Calibri" w:eastAsia="Calibri" w:hAnsi="Calibri"/>
+          <w:color w:val="202124"/>
+          <w:sz w:val="20"/>
+          <w:szCs w:val="20"/>
+        </w:rPr>
+        <w:t xml:space="preserve">Hệ thống dùng tên workbook để xác định đúng thư mục bài học và ưu tiên </w:t>
+      </w:r>
+      <w:r>
+        <w:rPr>
+          <w:rFonts w:ascii="Courier New" w:cs="Courier New" w:eastAsia="Courier New" w:hAnsi="Courier New"/>
+          <w:color w:val="1F4D78"/>
+          <w:sz w:val="18"/>
+          <w:szCs w:val="18"/>
+          <w:shd w:fill="EEF2F6" w:color="auto" w:val="clear"/>
+        </w:rPr>
+        <w:t xml:space="preserve">media/</w:t>
+      </w:r>
+      <w:r>
+        <w:rPr>
+          <w:rFonts w:ascii="Calibri" w:cs="Calibri" w:eastAsia="Calibri" w:hAnsi="Calibri"/>
+          <w:color w:val="202124"/>
+          <w:sz w:val="20"/>
+          <w:szCs w:val="20"/>
+        </w:rPr>
+        <w:t xml:space="preserve"> trong thư mục đó. Ví dụ, khi import </w:t>
+      </w:r>
+      <w:r>
+        <w:rPr>
+          <w:rFonts w:ascii="Courier New" w:cs="Courier New" w:eastAsia="Courier New" w:hAnsi="Courier New"/>
+          <w:color w:val="1F4D78"/>
+          <w:sz w:val="18"/>
+          <w:szCs w:val="18"/>
+          <w:shd w:fill="EEF2F6" w:color="auto" w:val="clear"/>
+        </w:rPr>
+        <w:t xml:space="preserve">SNLT-HP01-B02.xlsx</w:t>
+      </w:r>
+      <w:r>
+        <w:rPr>
+          <w:rFonts w:ascii="Calibri" w:cs="Calibri" w:eastAsia="Calibri" w:hAnsi="Calibri"/>
+          <w:color w:val="202124"/>
+          <w:sz w:val="20"/>
+          <w:szCs w:val="20"/>
+        </w:rPr>
+        <w:t xml:space="preserve">, ảnh được tìm trong </w:t>
+      </w:r>
+      <w:r>
+        <w:rPr>
+          <w:rFonts w:ascii="Courier New" w:cs="Courier New" w:eastAsia="Courier New" w:hAnsi="Courier New"/>
+          <w:color w:val="1F4D78"/>
+          <w:sz w:val="18"/>
+          <w:szCs w:val="18"/>
+          <w:shd w:fill="EEF2F6" w:color="auto" w:val="clear"/>
+        </w:rPr>
+        <w:t xml:space="preserve">SNLT-HP01-B02/media/</w:t>
+      </w:r>
+      <w:r>
+        <w:rPr>
+          <w:rFonts w:ascii="Calibri" w:cs="Calibri" w:eastAsia="Calibri" w:hAnsi="Calibri"/>
+          <w:color w:val="202124"/>
+          <w:sz w:val="20"/>
+          <w:szCs w:val="20"/>
+        </w:rPr>
+        <w:t xml:space="preserve">, không lấy từ bài học khác.</w:t>
+      </w:r>
+    </w:p>
+    <w:p>
+      <w:pPr>
+        <w:spacing w:after="100" w:line="280" w:lineRule="auto"/>
+      </w:pPr>
+      <w:r>
+        <w:rPr>
+          <w:rFonts w:ascii="Calibri" w:cs="Calibri" w:eastAsia="Calibri" w:hAnsi="Calibri"/>
+          <w:color w:val="202124"/>
+          <w:sz w:val="20"/>
+          <w:szCs w:val="20"/>
+        </w:rPr>
+        <w:t xml:space="preserve">Không dùng cách import riêng Excel nếu workbook nằm trong một thư mục bất kỳ ngoài </w:t>
+      </w:r>
+      <w:r>
+        <w:rPr>
+          <w:rFonts w:ascii="Courier New" w:cs="Courier New" w:eastAsia="Courier New" w:hAnsi="Courier New"/>
+          <w:color w:val="1F4D78"/>
+          <w:sz w:val="18"/>
+          <w:szCs w:val="18"/>
+          <w:shd w:fill="EEF2F6" w:color="auto" w:val="clear"/>
+        </w:rPr>
+        <w:t xml:space="preserve">ImportTemplate</w:t>
+      </w:r>
+      <w:r>
+        <w:rPr>
+          <w:rFonts w:ascii="Calibri" w:cs="Calibri" w:eastAsia="Calibri" w:hAnsi="Calibri"/>
+          <w:color w:val="202124"/>
+          <w:sz w:val="20"/>
+          <w:szCs w:val="20"/>
+        </w:rPr>
+        <w:t xml:space="preserve">; server không biết đường dẫn gốc trên máy người dùng. Trong trường hợp đó hãy import ZIP.</w:t>
+      </w:r>
+    </w:p>
+    <w:p>
+      <w:pPr>
+        <w:pStyle w:val="Heading2"/>
+        <w:keepNext/>
+        <w:spacing w:after="140" w:before="280"/>
+      </w:pPr>
+      <w:r>
+        <w:rPr>
+          <w:rFonts w:ascii="Calibri" w:cs="Calibri" w:eastAsia="Calibri" w:hAnsi="Calibri"/>
+          <w:b/>
+          <w:bCs/>
+          <w:color w:val="2E74B5"/>
+          <w:sz w:val="25"/>
+          <w:szCs w:val="25"/>
+        </w:rPr>
+        <w:t xml:space="preserve">4.4. Quy tắc đặt tên và sắp xếp trong ImportTemplate</w:t>
+      </w:r>
+    </w:p>
+    <w:p>
+      <w:pPr>
+        <w:pStyle w:val="ListParagraph"/>
+        <w:numPr>
+          <w:ilvl w:val="0"/>
+          <w:numId w:val="2"/>
+        </w:numPr>
+        <w:spacing w:after="60" w:line="280" w:lineRule="auto"/>
+      </w:pPr>
+      <w:r>
+        <w:rPr>
+          <w:rFonts w:ascii="Calibri" w:cs="Calibri" w:eastAsia="Calibri" w:hAnsi="Calibri"/>
+          <w:color w:val="202124"/>
+          <w:sz w:val="20"/>
+          <w:szCs w:val="20"/>
+        </w:rPr>
+        <w:t xml:space="preserve">Tên thư mục bài học phải duy nhất.</w:t>
+      </w:r>
+    </w:p>
+    <w:p>
+      <w:pPr>
+        <w:pStyle w:val="ListParagraph"/>
+        <w:numPr>
+          <w:ilvl w:val="0"/>
+          <w:numId w:val="2"/>
+        </w:numPr>
+        <w:spacing w:after="60" w:line="280" w:lineRule="auto"/>
+      </w:pPr>
+      <w:r>
+        <w:rPr>
+          <w:rFonts w:ascii="Calibri" w:cs="Calibri" w:eastAsia="Calibri" w:hAnsi="Calibri"/>
+          <w:color w:val="202124"/>
+          <w:sz w:val="20"/>
+          <w:szCs w:val="20"/>
+        </w:rPr>
+        <w:t xml:space="preserve">Tên file Excel phải trùng chính xác tên thư mục, ví dụ </w:t>
+      </w:r>
+      <w:r>
+        <w:rPr>
+          <w:rFonts w:ascii="Courier New" w:cs="Courier New" w:eastAsia="Courier New" w:hAnsi="Courier New"/>
+          <w:color w:val="1F4D78"/>
+          <w:sz w:val="18"/>
+          <w:szCs w:val="18"/>
+          <w:shd w:fill="EEF2F6" w:color="auto" w:val="clear"/>
+        </w:rPr>
+        <w:t xml:space="preserve">SNLT-HP01-B01/SNLT-HP01-B01.xlsx</w:t>
+      </w:r>
+      <w:r>
+        <w:rPr>
+          <w:rFonts w:ascii="Calibri" w:cs="Calibri" w:eastAsia="Calibri" w:hAnsi="Calibri"/>
+          <w:color w:val="202124"/>
+          <w:sz w:val="20"/>
+          <w:szCs w:val="20"/>
+        </w:rPr>
+        <w:t xml:space="preserve">.</w:t>
+      </w:r>
+    </w:p>
+    <w:p>
+      <w:pPr>
+        <w:pStyle w:val="ListParagraph"/>
+        <w:numPr>
+          <w:ilvl w:val="0"/>
+          <w:numId w:val="2"/>
+        </w:numPr>
+        <w:spacing w:after="60" w:line="280" w:lineRule="auto"/>
+      </w:pPr>
+      <w:r>
+        <w:rPr>
+          <w:rFonts w:ascii="Calibri" w:cs="Calibri" w:eastAsia="Calibri" w:hAnsi="Calibri"/>
+          <w:color w:val="202124"/>
+          <w:sz w:val="20"/>
+          <w:szCs w:val="20"/>
+        </w:rPr>
+        <w:t xml:space="preserve">Không đặt nhiều workbook cùng tên như </w:t>
+      </w:r>
+      <w:r>
+        <w:rPr>
+          <w:rFonts w:ascii="Courier New" w:cs="Courier New" w:eastAsia="Courier New" w:hAnsi="Courier New"/>
+          <w:color w:val="1F4D78"/>
+          <w:sz w:val="18"/>
+          <w:szCs w:val="18"/>
+          <w:shd w:fill="EEF2F6" w:color="auto" w:val="clear"/>
+        </w:rPr>
+        <w:t xml:space="preserve">quiz.xlsx</w:t>
+      </w:r>
+      <w:r>
+        <w:rPr>
+          <w:rFonts w:ascii="Calibri" w:cs="Calibri" w:eastAsia="Calibri" w:hAnsi="Calibri"/>
+          <w:color w:val="202124"/>
+          <w:sz w:val="20"/>
+          <w:szCs w:val="20"/>
+        </w:rPr>
+        <w:t xml:space="preserve"> trong các thư mục bài học khác nhau.</w:t>
+      </w:r>
+    </w:p>
+    <w:p>
+      <w:pPr>
+        <w:pStyle w:val="ListParagraph"/>
+        <w:numPr>
+          <w:ilvl w:val="0"/>
+          <w:numId w:val="2"/>
+        </w:numPr>
+        <w:spacing w:after="60" w:line="280" w:lineRule="auto"/>
+      </w:pPr>
+      <w:r>
+        <w:rPr>
+          <w:rFonts w:ascii="Calibri" w:cs="Calibri" w:eastAsia="Calibri" w:hAnsi="Calibri"/>
+          <w:color w:val="202124"/>
+          <w:sz w:val="20"/>
+          <w:szCs w:val="20"/>
+        </w:rPr>
+        <w:t xml:space="preserve">Mỗi bài học có </w:t>
+      </w:r>
+      <w:r>
+        <w:rPr>
+          <w:rFonts w:ascii="Courier New" w:cs="Courier New" w:eastAsia="Courier New" w:hAnsi="Courier New"/>
+          <w:color w:val="1F4D78"/>
+          <w:sz w:val="18"/>
+          <w:szCs w:val="18"/>
+          <w:shd w:fill="EEF2F6" w:color="auto" w:val="clear"/>
+        </w:rPr>
+        <w:t xml:space="preserve">media/</w:t>
+      </w:r>
+      <w:r>
+        <w:rPr>
+          <w:rFonts w:ascii="Calibri" w:cs="Calibri" w:eastAsia="Calibri" w:hAnsi="Calibri"/>
+          <w:color w:val="202124"/>
+          <w:sz w:val="20"/>
+          <w:szCs w:val="20"/>
+        </w:rPr>
+        <w:t xml:space="preserve"> riêng; không tạo kho ảnh dùng chung tại </w:t>
+      </w:r>
+      <w:r>
+        <w:rPr>
+          <w:rFonts w:ascii="Courier New" w:cs="Courier New" w:eastAsia="Courier New" w:hAnsi="Courier New"/>
+          <w:color w:val="1F4D78"/>
+          <w:sz w:val="18"/>
+          <w:szCs w:val="18"/>
+          <w:shd w:fill="EEF2F6" w:color="auto" w:val="clear"/>
+        </w:rPr>
+        <w:t xml:space="preserve">ImportTemplate/media/</w:t>
+      </w:r>
+      <w:r>
+        <w:rPr>
+          <w:rFonts w:ascii="Calibri" w:cs="Calibri" w:eastAsia="Calibri" w:hAnsi="Calibri"/>
+          <w:color w:val="202124"/>
+          <w:sz w:val="20"/>
+          <w:szCs w:val="20"/>
+        </w:rPr>
+        <w:t xml:space="preserve">.</w:t>
+      </w:r>
+    </w:p>
+    <w:p>
+      <w:pPr>
+        <w:pStyle w:val="ListParagraph"/>
+        <w:numPr>
+          <w:ilvl w:val="0"/>
+          <w:numId w:val="2"/>
+        </w:numPr>
+        <w:spacing w:after="60" w:line="280" w:lineRule="auto"/>
+      </w:pPr>
+      <w:r>
+        <w:rPr>
+          <w:rFonts w:ascii="Calibri" w:cs="Calibri" w:eastAsia="Calibri" w:hAnsi="Calibri"/>
+          <w:color w:val="202124"/>
+          <w:sz w:val="20"/>
+          <w:szCs w:val="20"/>
+        </w:rPr>
+        <w:t xml:space="preserve">Trong một bài học, tên file ảnh phải duy nhất. Nên dùng tiền tố câu hỏi như </w:t>
+      </w:r>
+      <w:r>
+        <w:rPr>
+          <w:rFonts w:ascii="Courier New" w:cs="Courier New" w:eastAsia="Courier New" w:hAnsi="Courier New"/>
+          <w:color w:val="1F4D78"/>
+          <w:sz w:val="18"/>
+          <w:szCs w:val="18"/>
+          <w:shd w:fill="EEF2F6" w:color="auto" w:val="clear"/>
+        </w:rPr>
+        <w:t xml:space="preserve">q01_question.jpg</w:t>
+      </w:r>
+      <w:r>
+        <w:rPr>
+          <w:rFonts w:ascii="Calibri" w:cs="Calibri" w:eastAsia="Calibri" w:hAnsi="Calibri"/>
+          <w:color w:val="202124"/>
+          <w:sz w:val="20"/>
+          <w:szCs w:val="20"/>
+        </w:rPr>
+        <w:t xml:space="preserve">, </w:t>
+      </w:r>
+      <w:r>
+        <w:rPr>
+          <w:rFonts w:ascii="Courier New" w:cs="Courier New" w:eastAsia="Courier New" w:hAnsi="Courier New"/>
+          <w:color w:val="1F4D78"/>
+          <w:sz w:val="18"/>
+          <w:szCs w:val="18"/>
+          <w:shd w:fill="EEF2F6" w:color="auto" w:val="clear"/>
+        </w:rPr>
+        <w:t xml:space="preserve">q01_answer_a.jpg</w:t>
+      </w:r>
+      <w:r>
+        <w:rPr>
+          <w:rFonts w:ascii="Calibri" w:cs="Calibri" w:eastAsia="Calibri" w:hAnsi="Calibri"/>
+          <w:color w:val="202124"/>
+          <w:sz w:val="20"/>
+          <w:szCs w:val="20"/>
+        </w:rPr>
+        <w:t xml:space="preserve">.</w:t>
+      </w:r>
+    </w:p>
+    <w:p>
+      <w:pPr>
+        <w:pStyle w:val="ListParagraph"/>
+        <w:numPr>
+          <w:ilvl w:val="0"/>
+          <w:numId w:val="2"/>
+        </w:numPr>
+        <w:spacing w:after="60" w:line="280" w:lineRule="auto"/>
+      </w:pPr>
+      <w:r>
+        <w:rPr>
+          <w:rFonts w:ascii="Calibri" w:cs="Calibri" w:eastAsia="Calibri" w:hAnsi="Calibri"/>
+          <w:color w:val="202124"/>
+          <w:sz w:val="20"/>
+          <w:szCs w:val="20"/>
+        </w:rPr>
+        <w:t xml:space="preserve">Tên file trong Excel phải khớp chính xác tên thật, kể cả chữ hoa/thường.</w:t>
+      </w:r>
+    </w:p>
+    <w:p>
+      <w:pPr>
+        <w:pStyle w:val="ListParagraph"/>
+        <w:numPr>
+          <w:ilvl w:val="0"/>
+          <w:numId w:val="2"/>
+        </w:numPr>
+        <w:spacing w:after="60" w:line="280" w:lineRule="auto"/>
+      </w:pPr>
+      <w:r>
+        <w:rPr>
+          <w:rFonts w:ascii="Calibri" w:cs="Calibri" w:eastAsia="Calibri" w:hAnsi="Calibri"/>
+          <w:color w:val="202124"/>
+          <w:sz w:val="20"/>
+          <w:szCs w:val="20"/>
+        </w:rPr>
+        <w:t xml:space="preserve">Không dùng đường dẫn tuyệt đối </w:t>
+      </w:r>
+      <w:r>
+        <w:rPr>
+          <w:rFonts w:ascii="Courier New" w:cs="Courier New" w:eastAsia="Courier New" w:hAnsi="Courier New"/>
+          <w:color w:val="1F4D78"/>
+          <w:sz w:val="18"/>
+          <w:szCs w:val="18"/>
+          <w:shd w:fill="EEF2F6" w:color="auto" w:val="clear"/>
+        </w:rPr>
+        <w:t xml:space="preserve">/Users/...</w:t>
+      </w:r>
+      <w:r>
+        <w:rPr>
+          <w:rFonts w:ascii="Calibri" w:cs="Calibri" w:eastAsia="Calibri" w:hAnsi="Calibri"/>
+          <w:color w:val="202124"/>
+          <w:sz w:val="20"/>
+          <w:szCs w:val="20"/>
+        </w:rPr>
+        <w:t xml:space="preserve">, </w:t>
+      </w:r>
+      <w:r>
+        <w:rPr>
+          <w:rFonts w:ascii="Courier New" w:cs="Courier New" w:eastAsia="Courier New" w:hAnsi="Courier New"/>
+          <w:color w:val="1F4D78"/>
+          <w:sz w:val="18"/>
+          <w:szCs w:val="18"/>
+          <w:shd w:fill="EEF2F6" w:color="auto" w:val="clear"/>
+        </w:rPr>
+        <w:t xml:space="preserve">C:\...</w:t>
+      </w:r>
+      <w:r>
+        <w:rPr>
+          <w:rFonts w:ascii="Calibri" w:cs="Calibri" w:eastAsia="Calibri" w:hAnsi="Calibri"/>
+          <w:color w:val="202124"/>
+          <w:sz w:val="20"/>
+          <w:szCs w:val="20"/>
+        </w:rPr>
+        <w:t xml:space="preserve"> hoặc đường dẫn ra ngoài bằng </w:t>
+      </w:r>
+      <w:r>
+        <w:rPr>
+          <w:rFonts w:ascii="Courier New" w:cs="Courier New" w:eastAsia="Courier New" w:hAnsi="Courier New"/>
+          <w:color w:val="1F4D78"/>
+          <w:sz w:val="18"/>
+          <w:szCs w:val="18"/>
+          <w:shd w:fill="EEF2F6" w:color="auto" w:val="clear"/>
+        </w:rPr>
+        <w:t xml:space="preserve">../</w:t>
+      </w:r>
+      <w:r>
+        <w:rPr>
+          <w:rFonts w:ascii="Calibri" w:cs="Calibri" w:eastAsia="Calibri" w:hAnsi="Calibri"/>
+          <w:color w:val="202124"/>
+          <w:sz w:val="20"/>
+          <w:szCs w:val="20"/>
+        </w:rPr>
+        <w:t xml:space="preserve">.</w:t>
+      </w:r>
+    </w:p>
+    <w:p>
+      <w:pPr>
+        <w:pStyle w:val="ListParagraph"/>
+        <w:numPr>
+          <w:ilvl w:val="0"/>
+          <w:numId w:val="2"/>
+        </w:numPr>
+        <w:spacing w:after="60" w:line="280" w:lineRule="auto"/>
+      </w:pPr>
+      <w:r>
+        <w:rPr>
+          <w:rFonts w:ascii="Calibri" w:cs="Calibri" w:eastAsia="Calibri" w:hAnsi="Calibri"/>
+          <w:color w:val="202124"/>
+          <w:sz w:val="20"/>
+          <w:szCs w:val="20"/>
+        </w:rPr>
+        <w:t xml:space="preserve">Có thể dùng cùng tên </w:t>
+      </w:r>
+      <w:r>
+        <w:rPr>
+          <w:rFonts w:ascii="Courier New" w:cs="Courier New" w:eastAsia="Courier New" w:hAnsi="Courier New"/>
+          <w:color w:val="1F4D78"/>
+          <w:sz w:val="18"/>
+          <w:szCs w:val="18"/>
+          <w:shd w:fill="EEF2F6" w:color="auto" w:val="clear"/>
+        </w:rPr>
+        <w:t xml:space="preserve">quiz_cover.jpg</w:t>
+      </w:r>
+      <w:r>
+        <w:rPr>
+          <w:rFonts w:ascii="Calibri" w:cs="Calibri" w:eastAsia="Calibri" w:hAnsi="Calibri"/>
+          <w:color w:val="202124"/>
+          <w:sz w:val="20"/>
+          <w:szCs w:val="20"/>
+        </w:rPr>
+        <w:t xml:space="preserve"> ở nhiều bài học nếu cấu trúc thư mục và tên workbook đúng chuẩn; tuy nhiên đặt tiền tố bài học sẽ giúp QA dễ hơn.</w:t>
+      </w:r>
+    </w:p>
+    <w:p>
+      <w:pPr>
+        <w:spacing w:after="100" w:line="280" w:lineRule="auto"/>
+      </w:pPr>
+      <w:r>
+        <w:rPr>
+          <w:rFonts w:ascii="Calibri" w:cs="Calibri" w:eastAsia="Calibri" w:hAnsi="Calibri"/>
+          <w:color w:val="202124"/>
+          <w:sz w:val="20"/>
+          <w:szCs w:val="20"/>
+        </w:rPr>
+        <w:t xml:space="preserve">Nếu có nhiều kết quả không thể phân biệt, hệ thống báo cảnh báo media thay vì tự chọn ngẫu nhiên ảnh của bài học khác.</w:t>
+      </w:r>
+    </w:p>
+    <w:p>
+      <w:pPr>
+        <w:pStyle w:val="Heading2"/>
+        <w:keepNext/>
+        <w:spacing w:after="140" w:before="280"/>
+      </w:pPr>
+      <w:r>
+        <w:rPr>
+          <w:rFonts w:ascii="Calibri" w:cs="Calibri" w:eastAsia="Calibri" w:hAnsi="Calibri"/>
+          <w:b/>
+          <w:bCs/>
+          <w:color w:val="2E74B5"/>
+          <w:sz w:val="25"/>
+          <w:szCs w:val="25"/>
+        </w:rPr>
+        <w:t xml:space="preserve">4.5. Quy trình xây dựng và kiểm tra</w:t>
       </w:r>
     </w:p>
     <w:p>
@@ -3055,26 +4103,7 @@
           <w:sz w:val="20"/>
           <w:szCs w:val="20"/>
         </w:rPr>
-        <w:t xml:space="preserve">Tải hoặc sao chép </w:t>
-      </w:r>
-      <w:r>
-        <w:rPr>
-          <w:rFonts w:ascii="Courier New" w:cs="Courier New" w:eastAsia="Courier New" w:hAnsi="Courier New"/>
-          <w:color w:val="1F4D78"/>
-          <w:sz w:val="18"/>
-          <w:szCs w:val="18"/>
-          <w:shd w:fill="EEF2F6" w:color="auto" w:val="clear"/>
-        </w:rPr>
-        <w:t xml:space="preserve">Full_quiz_9_types_teky_lms.zip</w:t>
-      </w:r>
-      <w:r>
-        <w:rPr>
-          <w:rFonts w:ascii="Calibri" w:cs="Calibri" w:eastAsia="Calibri" w:hAnsi="Calibri"/>
-          <w:color w:val="202124"/>
-          <w:sz w:val="20"/>
-          <w:szCs w:val="20"/>
-        </w:rPr>
-        <w:t xml:space="preserve">.</w:t>
+        <w:t xml:space="preserve">Sao chép thư mục/template bài học chuẩn và đổi đồng thời tên folder + Excel.</w:t>
       </w:r>
     </w:p>
     <w:p>
@@ -3098,7 +4127,64 @@
           <w:sz w:val="20"/>
           <w:szCs w:val="20"/>
         </w:rPr>
-        <w:t xml:space="preserve">Sửa Excel và thay media trong một thư mục làm việc riêng.</w:t>
+        <w:t xml:space="preserve">Điền </w:t>
+      </w:r>
+      <w:r>
+        <w:rPr>
+          <w:rFonts w:ascii="Courier New" w:cs="Courier New" w:eastAsia="Courier New" w:hAnsi="Courier New"/>
+          <w:color w:val="1F4D78"/>
+          <w:sz w:val="18"/>
+          <w:szCs w:val="18"/>
+          <w:shd w:fill="EEF2F6" w:color="auto" w:val="clear"/>
+        </w:rPr>
+        <w:t xml:space="preserve">Quiz Settings</w:t>
+      </w:r>
+      <w:r>
+        <w:rPr>
+          <w:rFonts w:ascii="Calibri" w:cs="Calibri" w:eastAsia="Calibri" w:hAnsi="Calibri"/>
+          <w:color w:val="202124"/>
+          <w:sz w:val="20"/>
+          <w:szCs w:val="20"/>
+        </w:rPr>
+        <w:t xml:space="preserve">, </w:t>
+      </w:r>
+      <w:r>
+        <w:rPr>
+          <w:rFonts w:ascii="Courier New" w:cs="Courier New" w:eastAsia="Courier New" w:hAnsi="Courier New"/>
+          <w:color w:val="1F4D78"/>
+          <w:sz w:val="18"/>
+          <w:szCs w:val="18"/>
+          <w:shd w:fill="EEF2F6" w:color="auto" w:val="clear"/>
+        </w:rPr>
+        <w:t xml:space="preserve">Quiz Questions</w:t>
+      </w:r>
+      <w:r>
+        <w:rPr>
+          <w:rFonts w:ascii="Calibri" w:cs="Calibri" w:eastAsia="Calibri" w:hAnsi="Calibri"/>
+          <w:color w:val="202124"/>
+          <w:sz w:val="20"/>
+          <w:szCs w:val="20"/>
+        </w:rPr>
+        <w:t xml:space="preserve">; đặt ảnh vào </w:t>
+      </w:r>
+      <w:r>
+        <w:rPr>
+          <w:rFonts w:ascii="Courier New" w:cs="Courier New" w:eastAsia="Courier New" w:hAnsi="Courier New"/>
+          <w:color w:val="1F4D78"/>
+          <w:sz w:val="18"/>
+          <w:szCs w:val="18"/>
+          <w:shd w:fill="EEF2F6" w:color="auto" w:val="clear"/>
+        </w:rPr>
+        <w:t xml:space="preserve">media/</w:t>
+      </w:r>
+      <w:r>
+        <w:rPr>
+          <w:rFonts w:ascii="Calibri" w:cs="Calibri" w:eastAsia="Calibri" w:hAnsi="Calibri"/>
+          <w:color w:val="202124"/>
+          <w:sz w:val="20"/>
+          <w:szCs w:val="20"/>
+        </w:rPr>
+        <w:t xml:space="preserve">.</w:t>
       </w:r>
     </w:p>
     <w:p>
@@ -3122,26 +4208,7 @@
           <w:sz w:val="20"/>
           <w:szCs w:val="20"/>
         </w:rPr>
-        <w:t xml:space="preserve">Nén Excel + </w:t>
-      </w:r>
-      <w:r>
-        <w:rPr>
-          <w:rFonts w:ascii="Courier New" w:cs="Courier New" w:eastAsia="Courier New" w:hAnsi="Courier New"/>
-          <w:color w:val="1F4D78"/>
-          <w:sz w:val="18"/>
-          <w:szCs w:val="18"/>
-          <w:shd w:fill="EEF2F6" w:color="auto" w:val="clear"/>
-        </w:rPr>
-        <w:t xml:space="preserve">media/</w:t>
-      </w:r>
-      <w:r>
-        <w:rPr>
-          <w:rFonts w:ascii="Calibri" w:cs="Calibri" w:eastAsia="Calibri" w:hAnsi="Calibri"/>
-          <w:color w:val="202124"/>
-          <w:sz w:val="20"/>
-          <w:szCs w:val="20"/>
-        </w:rPr>
-        <w:t xml:space="preserve"> thành zip.</w:t>
+        <w:t xml:space="preserve">Kiểm tra toàn bộ đường dẫn ảnh trong Excel.</w:t>
       </w:r>
     </w:p>
     <w:p>
@@ -3165,6 +4232,92 @@
           <w:sz w:val="20"/>
           <w:szCs w:val="20"/>
         </w:rPr>
+        <w:t xml:space="preserve">Chạy local: có thể import riêng Excel nếu nguồn nằm đúng trong </w:t>
+      </w:r>
+      <w:r>
+        <w:rPr>
+          <w:rFonts w:ascii="Courier New" w:cs="Courier New" w:eastAsia="Courier New" w:hAnsi="Courier New"/>
+          <w:color w:val="1F4D78"/>
+          <w:sz w:val="18"/>
+          <w:szCs w:val="18"/>
+          <w:shd w:fill="EEF2F6" w:color="auto" w:val="clear"/>
+        </w:rPr>
+        <w:t xml:space="preserve">ImportTemplate</w:t>
+      </w:r>
+      <w:r>
+        <w:rPr>
+          <w:rFonts w:ascii="Calibri" w:cs="Calibri" w:eastAsia="Calibri" w:hAnsi="Calibri"/>
+          <w:color w:val="202124"/>
+          <w:sz w:val="20"/>
+          <w:szCs w:val="20"/>
+        </w:rPr>
+        <w:t xml:space="preserve">.</w:t>
+      </w:r>
+    </w:p>
+    <w:p>
+      <w:pPr>
+        <w:spacing w:after="60" w:line="280" w:lineRule="auto"/>
+        <w:ind w:left="540" w:hanging="270"/>
+      </w:pPr>
+      <w:r>
+        <w:rPr>
+          <w:rFonts w:ascii="Calibri" w:cs="Calibri" w:eastAsia="Calibri" w:hAnsi="Calibri"/>
+          <w:color w:val="202124"/>
+          <w:sz w:val="20"/>
+          <w:szCs w:val="20"/>
+        </w:rPr>
+        <w:t xml:space="preserve">6. </w:t>
+      </w:r>
+      <w:r>
+        <w:rPr>
+          <w:rFonts w:ascii="Calibri" w:cs="Calibri" w:eastAsia="Calibri" w:hAnsi="Calibri"/>
+          <w:color w:val="202124"/>
+          <w:sz w:val="20"/>
+          <w:szCs w:val="20"/>
+        </w:rPr>
+        <w:t xml:space="preserve">Chạy web/deploy hoặc bàn giao: nén Excel + </w:t>
+      </w:r>
+      <w:r>
+        <w:rPr>
+          <w:rFonts w:ascii="Courier New" w:cs="Courier New" w:eastAsia="Courier New" w:hAnsi="Courier New"/>
+          <w:color w:val="1F4D78"/>
+          <w:sz w:val="18"/>
+          <w:szCs w:val="18"/>
+          <w:shd w:fill="EEF2F6" w:color="auto" w:val="clear"/>
+        </w:rPr>
+        <w:t xml:space="preserve">media/</w:t>
+      </w:r>
+      <w:r>
+        <w:rPr>
+          <w:rFonts w:ascii="Calibri" w:cs="Calibri" w:eastAsia="Calibri" w:hAnsi="Calibri"/>
+          <w:color w:val="202124"/>
+          <w:sz w:val="20"/>
+          <w:szCs w:val="20"/>
+        </w:rPr>
+        <w:t xml:space="preserve"> thành ZIP.</w:t>
+      </w:r>
+    </w:p>
+    <w:p>
+      <w:pPr>
+        <w:spacing w:after="60" w:line="280" w:lineRule="auto"/>
+        <w:ind w:left="540" w:hanging="270"/>
+      </w:pPr>
+      <w:r>
+        <w:rPr>
+          <w:rFonts w:ascii="Calibri" w:cs="Calibri" w:eastAsia="Calibri" w:hAnsi="Calibri"/>
+          <w:color w:val="202124"/>
+          <w:sz w:val="20"/>
+          <w:szCs w:val="20"/>
+        </w:rPr>
+        <w:t xml:space="preserve">7. </w:t>
+      </w:r>
+      <w:r>
+        <w:rPr>
+          <w:rFonts w:ascii="Calibri" w:cs="Calibri" w:eastAsia="Calibri" w:hAnsi="Calibri"/>
+          <w:color w:val="202124"/>
+          <w:sz w:val="20"/>
+          <w:szCs w:val="20"/>
+        </w:rPr>
         <w:t xml:space="preserve">Import vào vùng </w:t>
       </w:r>
       <w:r>
@@ -3200,7 +4353,7 @@
           <w:sz w:val="20"/>
           <w:szCs w:val="20"/>
         </w:rPr>
-        <w:t xml:space="preserve">6. </w:t>
+        <w:t xml:space="preserve">8. </w:t>
       </w:r>
       <w:r>
         <w:rPr>
@@ -3228,7 +4381,7 @@
           <w:sz w:val="20"/>
           <w:szCs w:val="20"/>
         </w:rPr>
-        <w:t xml:space="preserve">: tổng dòng, imported, skipped, error và media warning.</w:t>
+        <w:t xml:space="preserve">; xử lý hết error và media warning.</w:t>
       </w:r>
     </w:p>
     <w:p>
@@ -3243,7 +4396,7 @@
           <w:sz w:val="20"/>
           <w:szCs w:val="20"/>
         </w:rPr>
-        <w:t xml:space="preserve">7. </w:t>
+        <w:t xml:space="preserve">9. </w:t>
       </w:r>
       <w:r>
         <w:rPr>
@@ -3327,7 +4480,7 @@
           <w:sz w:val="20"/>
           <w:szCs w:val="20"/>
         </w:rPr>
-        <w:t xml:space="preserve">8. </w:t>
+        <w:t xml:space="preserve">10. </w:t>
       </w:r>
       <w:r>
         <w:rPr>
@@ -3356,7 +4509,27 @@
           <w:sz w:val="20"/>
           <w:szCs w:val="20"/>
         </w:rPr>
-        <w:t xml:space="preserve">.</w:t>
+        <w:t xml:space="preserve">, sau đó </w:t>
+      </w:r>
+      <w:r>
+        <w:rPr>
+          <w:rFonts w:ascii="Calibri" w:cs="Calibri" w:eastAsia="Calibri" w:hAnsi="Calibri"/>
+          <w:b/>
+          <w:bCs/>
+          <w:color w:val="202124"/>
+          <w:sz w:val="20"/>
+          <w:szCs w:val="20"/>
+        </w:rPr>
+        <w:t xml:space="preserve">Xem &amp; Làm bài</w:t>
+      </w:r>
+      <w:r>
+        <w:rPr>
+          <w:rFonts w:ascii="Calibri" w:cs="Calibri" w:eastAsia="Calibri" w:hAnsi="Calibri"/>
+          <w:color w:val="202124"/>
+          <w:sz w:val="20"/>
+          <w:szCs w:val="20"/>
+        </w:rPr>
+        <w:t xml:space="preserve"> để review.</w:t>
       </w:r>
     </w:p>
     <w:p>
@@ -3371,51 +4544,7 @@
           <w:sz w:val="20"/>
           <w:szCs w:val="20"/>
         </w:rPr>
-        <w:t xml:space="preserve">9. </w:t>
-      </w:r>
-      <w:r>
-        <w:rPr>
-          <w:rFonts w:ascii="Calibri" w:cs="Calibri" w:eastAsia="Calibri" w:hAnsi="Calibri"/>
-          <w:color w:val="202124"/>
-          <w:sz w:val="20"/>
-          <w:szCs w:val="20"/>
-        </w:rPr>
-        <w:t xml:space="preserve">Nhấn </w:t>
-      </w:r>
-      <w:r>
-        <w:rPr>
-          <w:rFonts w:ascii="Calibri" w:cs="Calibri" w:eastAsia="Calibri" w:hAnsi="Calibri"/>
-          <w:b/>
-          <w:bCs/>
-          <w:color w:val="202124"/>
-          <w:sz w:val="20"/>
-          <w:szCs w:val="20"/>
-        </w:rPr>
-        <w:t xml:space="preserve">Xem &amp; Làm bài</w:t>
-      </w:r>
-      <w:r>
-        <w:rPr>
-          <w:rFonts w:ascii="Calibri" w:cs="Calibri" w:eastAsia="Calibri" w:hAnsi="Calibri"/>
-          <w:color w:val="202124"/>
-          <w:sz w:val="20"/>
-          <w:szCs w:val="20"/>
-        </w:rPr>
-        <w:t xml:space="preserve"> để review đúng giao diện/tương tác LMS.</w:t>
-      </w:r>
-    </w:p>
-    <w:p>
-      <w:pPr>
-        <w:spacing w:after="60" w:line="280" w:lineRule="auto"/>
-        <w:ind w:left="540" w:hanging="270"/>
-      </w:pPr>
-      <w:r>
-        <w:rPr>
-          <w:rFonts w:ascii="Calibri" w:cs="Calibri" w:eastAsia="Calibri" w:hAnsi="Calibri"/>
-          <w:color w:val="202124"/>
-          <w:sz w:val="20"/>
-          <w:szCs w:val="20"/>
-        </w:rPr>
-        <w:t xml:space="preserve">10. </w:t>
+        <w:t xml:space="preserve">11. </w:t>
       </w:r>
       <w:r>
         <w:rPr>
@@ -4705,7 +5834,7 @@
                 <w:sz w:val="18"/>
                 <w:szCs w:val="18"/>
               </w:rPr>
-              <w:t xml:space="preserve">Image, Audio, Video</w:t>
+              <w:t xml:space="preserve">Image</w:t>
             </w:r>
           </w:p>
         </w:tc>
@@ -4727,7 +5856,7 @@
                 <w:sz w:val="18"/>
                 <w:szCs w:val="18"/>
               </w:rPr>
-              <w:t xml:space="preserve">Media cấp question</w:t>
+              <w:t xml:space="preserve">Ảnh cấp question; dùng file trong thư mục media/</w:t>
             </w:r>
           </w:p>
         </w:tc>
@@ -4755,7 +5884,7 @@
                 <w:sz w:val="18"/>
                 <w:szCs w:val="18"/>
               </w:rPr>
-              <w:t xml:space="preserve">Answer 1 ... Answer 10</w:t>
+              <w:t xml:space="preserve">Audio, Video</w:t>
             </w:r>
           </w:p>
         </w:tc>
@@ -4777,7 +5906,7 @@
                 <w:sz w:val="18"/>
                 <w:szCs w:val="18"/>
               </w:rPr>
-              <w:t xml:space="preserve">Nội dung đáp án</w:t>
+              <w:t xml:space="preserve">Chỉ dùng URL trực tuyến; Video hỗ trợ YouTube/Vimeo</w:t>
             </w:r>
           </w:p>
         </w:tc>
@@ -4805,7 +5934,7 @@
                 <w:sz w:val="18"/>
                 <w:szCs w:val="18"/>
               </w:rPr>
-              <w:t xml:space="preserve">Answer N Image</w:t>
+              <w:t xml:space="preserve">Answer 1 ... Answer 6</w:t>
             </w:r>
           </w:p>
         </w:tc>
@@ -4827,7 +5956,7 @@
                 <w:sz w:val="18"/>
                 <w:szCs w:val="18"/>
               </w:rPr>
-              <w:t xml:space="preserve">Ảnh của đáp án N</w:t>
+              <w:t xml:space="preserve">Nội dung đáp án; tối đa 6 đáp án</w:t>
             </w:r>
           </w:p>
         </w:tc>
@@ -4855,7 +5984,7 @@
                 <w:sz w:val="18"/>
                 <w:szCs w:val="18"/>
               </w:rPr>
-              <w:t xml:space="preserve">Answer N Left Image</w:t>
+              <w:t xml:space="preserve">Answer N Image</w:t>
             </w:r>
           </w:p>
         </w:tc>
@@ -4877,7 +6006,7 @@
                 <w:sz w:val="18"/>
                 <w:szCs w:val="18"/>
               </w:rPr>
-              <w:t xml:space="preserve">Ảnh vế trái Matching</w:t>
+              <w:t xml:space="preserve">Ảnh của đáp án N</w:t>
             </w:r>
           </w:p>
         </w:tc>
@@ -4905,7 +6034,7 @@
                 <w:sz w:val="18"/>
                 <w:szCs w:val="18"/>
               </w:rPr>
-              <w:t xml:space="preserve">Answer N Right Image</w:t>
+              <w:t xml:space="preserve">Answer N Left Image</w:t>
             </w:r>
           </w:p>
         </w:tc>
@@ -4927,7 +6056,7 @@
                 <w:sz w:val="18"/>
                 <w:szCs w:val="18"/>
               </w:rPr>
-              <w:t xml:space="preserve">Ảnh vế phải Matching</w:t>
+              <w:t xml:space="preserve">Ảnh vế trái Matching</w:t>
             </w:r>
           </w:p>
         </w:tc>
@@ -4955,7 +6084,7 @@
                 <w:sz w:val="18"/>
                 <w:szCs w:val="18"/>
               </w:rPr>
-              <w:t xml:space="preserve">Difficulty</w:t>
+              <w:t xml:space="preserve">Answer N Right Image</w:t>
             </w:r>
           </w:p>
         </w:tc>
@@ -4977,7 +6106,7 @@
                 <w:sz w:val="18"/>
                 <w:szCs w:val="18"/>
               </w:rPr>
-              <w:t xml:space="preserve">Độ khó của question</w:t>
+              <w:t xml:space="preserve">Ảnh vế phải Matching</w:t>
             </w:r>
           </w:p>
         </w:tc>
@@ -5005,7 +6134,7 @@
                 <w:sz w:val="18"/>
                 <w:szCs w:val="18"/>
               </w:rPr>
-              <w:t xml:space="preserve">Topic</w:t>
+              <w:t xml:space="preserve">Difficulty</w:t>
             </w:r>
           </w:p>
         </w:tc>
@@ -5027,7 +6156,7 @@
                 <w:sz w:val="18"/>
                 <w:szCs w:val="18"/>
               </w:rPr>
-              <w:t xml:space="preserve">Chủ đề question</w:t>
+              <w:t xml:space="preserve">Độ khó của question</w:t>
             </w:r>
           </w:p>
         </w:tc>
@@ -5055,7 +6184,7 @@
                 <w:sz w:val="18"/>
                 <w:szCs w:val="18"/>
               </w:rPr>
-              <w:t xml:space="preserve">Explanation</w:t>
+              <w:t xml:space="preserve">Topic</w:t>
             </w:r>
           </w:p>
         </w:tc>
@@ -5077,7 +6206,7 @@
                 <w:sz w:val="18"/>
                 <w:szCs w:val="18"/>
               </w:rPr>
-              <w:t xml:space="preserve">Giải thích hiển thị sau nộp bài</w:t>
+              <w:t xml:space="preserve">Chủ đề question</w:t>
             </w:r>
           </w:p>
         </w:tc>
@@ -5105,7 +6234,7 @@
                 <w:sz w:val="18"/>
                 <w:szCs w:val="18"/>
               </w:rPr>
-              <w:t xml:space="preserve">Points</w:t>
+              <w:t xml:space="preserve">Explanation</w:t>
             </w:r>
           </w:p>
         </w:tc>
@@ -5127,7 +6256,7 @@
                 <w:sz w:val="18"/>
                 <w:szCs w:val="18"/>
               </w:rPr>
-              <w:t xml:space="preserve">Điểm câu hỏi</w:t>
+              <w:t xml:space="preserve">Giải thích hiển thị sau nộp bài</w:t>
             </w:r>
           </w:p>
         </w:tc>
@@ -5155,7 +6284,7 @@
                 <w:sz w:val="18"/>
                 <w:szCs w:val="18"/>
               </w:rPr>
-              <w:t xml:space="preserve">Correct Feedback, Incorrect Feedback</w:t>
+              <w:t xml:space="preserve">Points</w:t>
             </w:r>
           </w:p>
         </w:tc>
@@ -5177,7 +6306,57 @@
                 <w:sz w:val="18"/>
                 <w:szCs w:val="18"/>
               </w:rPr>
-              <w:t xml:space="preserve">Phản hồi iSpring nếu cần</w:t>
+              <w:t xml:space="preserve">Điểm câu hỏi</w:t>
+            </w:r>
+          </w:p>
+        </w:tc>
+      </w:tr>
+      <w:tr>
+        <w:trPr>
+          <w:cantSplit/>
+          <w:tblHeader w:val="false"/>
+        </w:trPr>
+        <w:tc>
+          <w:tcPr>
+            <w:tcW w:type="dxa" w:w="2700"/>
+            <w:vAlign w:val="center"/>
+          </w:tcPr>
+          <w:p>
+            <w:pPr>
+              <w:spacing w:after="20" w:before="20" w:line="250" w:lineRule="auto"/>
+            </w:pPr>
+            <w:r>
+              <w:rPr>
+                <w:rFonts w:ascii="Calibri" w:cs="Calibri" w:eastAsia="Calibri" w:hAnsi="Calibri"/>
+                <w:b w:val="false"/>
+                <w:bCs w:val="false"/>
+                <w:color w:val="202124"/>
+                <w:sz w:val="18"/>
+                <w:szCs w:val="18"/>
+              </w:rPr>
+              <w:t xml:space="preserve">Required, Use Regex</w:t>
+            </w:r>
+          </w:p>
+        </w:tc>
+        <w:tc>
+          <w:tcPr>
+            <w:tcW w:type="dxa" w:w="6660"/>
+            <w:vAlign w:val="center"/>
+          </w:tcPr>
+          <w:p>
+            <w:pPr>
+              <w:spacing w:after="20" w:before="20" w:line="250" w:lineRule="auto"/>
+            </w:pPr>
+            <w:r>
+              <w:rPr>
+                <w:rFonts w:ascii="Calibri" w:cs="Calibri" w:eastAsia="Calibri" w:hAnsi="Calibri"/>
+                <w:b w:val="false"/>
+                <w:bCs w:val="false"/>
+                <w:color w:val="202124"/>
+                <w:sz w:val="18"/>
+                <w:szCs w:val="18"/>
+              </w:rPr>
+              <w:t xml:space="preserve">Bắt buộc trả lời và so khớp RegEx cho FIB/TI</w:t>
             </w:r>
           </w:p>
         </w:tc>
@@ -5237,7 +6416,7 @@
           <w:sz w:val="20"/>
           <w:szCs w:val="20"/>
         </w:rPr>
-        <w:t xml:space="preserve">. Hệ thống tạo ID duy nhất khi import, giữ ổn định trong session và sử dụng khi export.</w:t>
+        <w:t xml:space="preserve">. Hệ thống tạo ID duy nhất khi import, giữ ổn định trong session và sử dụng khi export. Mỗi câu hỏi có tối đa 6 đáp án; dạng Matching có tối đa 6 cặp ghép.</w:t>
       </w:r>
     </w:p>
     <w:p>
@@ -5687,7 +6866,7 @@
                 <w:sz w:val="18"/>
                 <w:szCs w:val="18"/>
               </w:rPr>
-              <w:t xml:space="preserve">Audio</w:t>
+              <w:t xml:space="preserve">Audio; URL HTTPS trực tiếp</w:t>
             </w:r>
           </w:p>
         </w:tc>
@@ -5737,7 +6916,7 @@
                 <w:sz w:val="18"/>
                 <w:szCs w:val="18"/>
               </w:rPr>
-              <w:t xml:space="preserve">Video; nên có Image làm poster</w:t>
+              <w:t xml:space="preserve">Video; URL YouTube hoặc Vimeo</w:t>
             </w:r>
           </w:p>
         </w:tc>
@@ -5838,56 +7017,6 @@
                 <w:szCs w:val="18"/>
               </w:rPr>
               <w:t xml:space="preserve">Answer N Left Image, Answer N Right Image</w:t>
-            </w:r>
-          </w:p>
-        </w:tc>
-      </w:tr>
-      <w:tr>
-        <w:trPr>
-          <w:cantSplit/>
-          <w:tblHeader w:val="false"/>
-        </w:trPr>
-        <w:tc>
-          <w:tcPr>
-            <w:tcW w:type="dxa" w:w="2700"/>
-            <w:vAlign w:val="center"/>
-          </w:tcPr>
-          <w:p>
-            <w:pPr>
-              <w:spacing w:after="20" w:before="20" w:line="250" w:lineRule="auto"/>
-            </w:pPr>
-            <w:r>
-              <w:rPr>
-                <w:rFonts w:ascii="Calibri" w:cs="Calibri" w:eastAsia="Calibri" w:hAnsi="Calibri"/>
-                <w:b w:val="false"/>
-                <w:bCs w:val="false"/>
-                <w:color w:val="202124"/>
-                <w:sz w:val="18"/>
-                <w:szCs w:val="18"/>
-              </w:rPr>
-              <w:t xml:space="preserve">Media trong một ô</w:t>
-            </w:r>
-          </w:p>
-        </w:tc>
-        <w:tc>
-          <w:tcPr>
-            <w:tcW w:type="dxa" w:w="6660"/>
-            <w:vAlign w:val="center"/>
-          </w:tcPr>
-          <w:p>
-            <w:pPr>
-              <w:spacing w:after="20" w:before="20" w:line="250" w:lineRule="auto"/>
-            </w:pPr>
-            <w:r>
-              <w:rPr>
-                <w:rFonts w:ascii="Calibri" w:cs="Calibri" w:eastAsia="Calibri" w:hAnsi="Calibri"/>
-                <w:b w:val="false"/>
-                <w:bCs w:val="false"/>
-                <w:color w:val="202124"/>
-                <w:sz w:val="18"/>
-                <w:szCs w:val="18"/>
-              </w:rPr>
-              <w:t xml:space="preserve">[image=media/file.png], [audio=media/file.mp3], [video=media/file.mp4]</w:t>
             </w:r>
           </w:p>
         </w:tc>
@@ -5951,7 +7080,7 @@
           <w:szCs w:val="18"/>
         </w:rPr>
         <w:br/>
-        <w:t xml:space="preserve">Answer 1: *Đáp án đúng [audio=media/q01_correct.mp3]</w:t>
+        <w:t xml:space="preserve">Video: https://www.youtube.com/watch?v=VIDEO_ID</w:t>
       </w:r>
       <w:r>
         <w:rPr>
@@ -5961,7 +7090,7 @@
           <w:szCs w:val="18"/>
         </w:rPr>
         <w:br/>
-        <w:t xml:space="preserve">Correct Feedback: Chính xác! [image=media/star.png]</w:t>
+        <w:t xml:space="preserve">Audio: https://cdn.example.com/audio/bai-hoc.mp3</w:t>
       </w:r>
     </w:p>
     <w:p>
@@ -6118,7 +7247,7 @@
           <w:sz w:val="20"/>
           <w:szCs w:val="20"/>
         </w:rPr>
-        <w:t xml:space="preserve">Audio: </w:t>
+        <w:t xml:space="preserve">Audio không lưu trong </w:t>
       </w:r>
       <w:r>
         <w:rPr>
@@ -6128,64 +7257,16 @@
           <w:szCs w:val="18"/>
           <w:shd w:fill="EEF2F6" w:color="auto" w:val="clear"/>
         </w:rPr>
-        <w:t xml:space="preserve">.mp3</w:t>
-      </w:r>
-      <w:r>
-        <w:rPr>
-          <w:rFonts w:ascii="Calibri" w:cs="Calibri" w:eastAsia="Calibri" w:hAnsi="Calibri"/>
-          <w:color w:val="202124"/>
-          <w:sz w:val="20"/>
-          <w:szCs w:val="20"/>
-        </w:rPr>
-        <w:t xml:space="preserve">, </w:t>
-      </w:r>
-      <w:r>
-        <w:rPr>
-          <w:rFonts w:ascii="Courier New" w:cs="Courier New" w:eastAsia="Courier New" w:hAnsi="Courier New"/>
-          <w:color w:val="1F4D78"/>
-          <w:sz w:val="18"/>
-          <w:szCs w:val="18"/>
-          <w:shd w:fill="EEF2F6" w:color="auto" w:val="clear"/>
-        </w:rPr>
-        <w:t xml:space="preserve">.wav</w:t>
-      </w:r>
-      <w:r>
-        <w:rPr>
-          <w:rFonts w:ascii="Calibri" w:cs="Calibri" w:eastAsia="Calibri" w:hAnsi="Calibri"/>
-          <w:color w:val="202124"/>
-          <w:sz w:val="20"/>
-          <w:szCs w:val="20"/>
-        </w:rPr>
-        <w:t xml:space="preserve">, </w:t>
-      </w:r>
-      <w:r>
-        <w:rPr>
-          <w:rFonts w:ascii="Courier New" w:cs="Courier New" w:eastAsia="Courier New" w:hAnsi="Courier New"/>
-          <w:color w:val="1F4D78"/>
-          <w:sz w:val="18"/>
-          <w:szCs w:val="18"/>
-          <w:shd w:fill="EEF2F6" w:color="auto" w:val="clear"/>
-        </w:rPr>
-        <w:t xml:space="preserve">.m4a</w:t>
-      </w:r>
-      <w:r>
-        <w:rPr>
-          <w:rFonts w:ascii="Calibri" w:cs="Calibri" w:eastAsia="Calibri" w:hAnsi="Calibri"/>
-          <w:color w:val="202124"/>
-          <w:sz w:val="20"/>
-          <w:szCs w:val="20"/>
-        </w:rPr>
-        <w:t xml:space="preserve">, </w:t>
-      </w:r>
-      <w:r>
-        <w:rPr>
-          <w:rFonts w:ascii="Courier New" w:cs="Courier New" w:eastAsia="Courier New" w:hAnsi="Courier New"/>
-          <w:color w:val="1F4D78"/>
-          <w:sz w:val="18"/>
-          <w:szCs w:val="18"/>
-          <w:shd w:fill="EEF2F6" w:color="auto" w:val="clear"/>
-        </w:rPr>
-        <w:t xml:space="preserve">.ogg</w:t>
+        <w:t xml:space="preserve">media/</w:t>
+      </w:r>
+      <w:r>
+        <w:rPr>
+          <w:rFonts w:ascii="Calibri" w:cs="Calibri" w:eastAsia="Calibri" w:hAnsi="Calibri"/>
+          <w:color w:val="202124"/>
+          <w:sz w:val="20"/>
+          <w:szCs w:val="20"/>
+        </w:rPr>
+        <w:t xml:space="preserve">; chỉ nhập URL HTTPS trực tiếp.</w:t>
       </w:r>
     </w:p>
     <w:p>
@@ -6204,7 +7285,7 @@
           <w:sz w:val="20"/>
           <w:szCs w:val="20"/>
         </w:rPr>
-        <w:t xml:space="preserve">Video: </w:t>
+        <w:t xml:space="preserve">Video không lưu trong </w:t>
       </w:r>
       <w:r>
         <w:rPr>
@@ -6214,45 +7295,16 @@
           <w:szCs w:val="18"/>
           <w:shd w:fill="EEF2F6" w:color="auto" w:val="clear"/>
         </w:rPr>
-        <w:t xml:space="preserve">.mp4</w:t>
-      </w:r>
-      <w:r>
-        <w:rPr>
-          <w:rFonts w:ascii="Calibri" w:cs="Calibri" w:eastAsia="Calibri" w:hAnsi="Calibri"/>
-          <w:color w:val="202124"/>
-          <w:sz w:val="20"/>
-          <w:szCs w:val="20"/>
-        </w:rPr>
-        <w:t xml:space="preserve">, </w:t>
-      </w:r>
-      <w:r>
-        <w:rPr>
-          <w:rFonts w:ascii="Courier New" w:cs="Courier New" w:eastAsia="Courier New" w:hAnsi="Courier New"/>
-          <w:color w:val="1F4D78"/>
-          <w:sz w:val="18"/>
-          <w:szCs w:val="18"/>
-          <w:shd w:fill="EEF2F6" w:color="auto" w:val="clear"/>
-        </w:rPr>
-        <w:t xml:space="preserve">.webm</w:t>
-      </w:r>
-      <w:r>
-        <w:rPr>
-          <w:rFonts w:ascii="Calibri" w:cs="Calibri" w:eastAsia="Calibri" w:hAnsi="Calibri"/>
-          <w:color w:val="202124"/>
-          <w:sz w:val="20"/>
-          <w:szCs w:val="20"/>
-        </w:rPr>
-        <w:t xml:space="preserve">, </w:t>
-      </w:r>
-      <w:r>
-        <w:rPr>
-          <w:rFonts w:ascii="Courier New" w:cs="Courier New" w:eastAsia="Courier New" w:hAnsi="Courier New"/>
-          <w:color w:val="1F4D78"/>
-          <w:sz w:val="18"/>
-          <w:szCs w:val="18"/>
-          <w:shd w:fill="EEF2F6" w:color="auto" w:val="clear"/>
-        </w:rPr>
-        <w:t xml:space="preserve">.mov</w:t>
+        <w:t xml:space="preserve">media/</w:t>
+      </w:r>
+      <w:r>
+        <w:rPr>
+          <w:rFonts w:ascii="Calibri" w:cs="Calibri" w:eastAsia="Calibri" w:hAnsi="Calibri"/>
+          <w:color w:val="202124"/>
+          <w:sz w:val="20"/>
+          <w:szCs w:val="20"/>
+        </w:rPr>
+        <w:t xml:space="preserve">; chỉ nhập URL YouTube hoặc Vimeo.</w:t>
       </w:r>
     </w:p>
     <w:p>
@@ -6266,102 +7318,7 @@
           <w:sz w:val="20"/>
           <w:szCs w:val="20"/>
         </w:rPr>
-        <w:t xml:space="preserve">Khi import, media được copy vào package và đăng ký trong session. Khi export JSON có cấu hình S3, media được upload lên FPT S3 và các trường </w:t>
-      </w:r>
-      <w:r>
-        <w:rPr>
-          <w:rFonts w:ascii="Courier New" w:cs="Courier New" w:eastAsia="Courier New" w:hAnsi="Courier New"/>
-          <w:color w:val="1F4D78"/>
-          <w:sz w:val="18"/>
-          <w:szCs w:val="18"/>
-          <w:shd w:fill="EEF2F6" w:color="auto" w:val="clear"/>
-        </w:rPr>
-        <w:t xml:space="preserve">coverImageUrl</w:t>
-      </w:r>
-      <w:r>
-        <w:rPr>
-          <w:rFonts w:ascii="Calibri" w:cs="Calibri" w:eastAsia="Calibri" w:hAnsi="Calibri"/>
-          <w:color w:val="202124"/>
-          <w:sz w:val="20"/>
-          <w:szCs w:val="20"/>
-        </w:rPr>
-        <w:t xml:space="preserve">, </w:t>
-      </w:r>
-      <w:r>
-        <w:rPr>
-          <w:rFonts w:ascii="Courier New" w:cs="Courier New" w:eastAsia="Courier New" w:hAnsi="Courier New"/>
-          <w:color w:val="1F4D78"/>
-          <w:sz w:val="18"/>
-          <w:szCs w:val="18"/>
-          <w:shd w:fill="EEF2F6" w:color="auto" w:val="clear"/>
-        </w:rPr>
-        <w:t xml:space="preserve">imageUrl</w:t>
-      </w:r>
-      <w:r>
-        <w:rPr>
-          <w:rFonts w:ascii="Calibri" w:cs="Calibri" w:eastAsia="Calibri" w:hAnsi="Calibri"/>
-          <w:color w:val="202124"/>
-          <w:sz w:val="20"/>
-          <w:szCs w:val="20"/>
-        </w:rPr>
-        <w:t xml:space="preserve">, </w:t>
-      </w:r>
-      <w:r>
-        <w:rPr>
-          <w:rFonts w:ascii="Courier New" w:cs="Courier New" w:eastAsia="Courier New" w:hAnsi="Courier New"/>
-          <w:color w:val="1F4D78"/>
-          <w:sz w:val="18"/>
-          <w:szCs w:val="18"/>
-          <w:shd w:fill="EEF2F6" w:color="auto" w:val="clear"/>
-        </w:rPr>
-        <w:t xml:space="preserve">leftImageUrl</w:t>
-      </w:r>
-      <w:r>
-        <w:rPr>
-          <w:rFonts w:ascii="Calibri" w:cs="Calibri" w:eastAsia="Calibri" w:hAnsi="Calibri"/>
-          <w:color w:val="202124"/>
-          <w:sz w:val="20"/>
-          <w:szCs w:val="20"/>
-        </w:rPr>
-        <w:t xml:space="preserve">, </w:t>
-      </w:r>
-      <w:r>
-        <w:rPr>
-          <w:rFonts w:ascii="Courier New" w:cs="Courier New" w:eastAsia="Courier New" w:hAnsi="Courier New"/>
-          <w:color w:val="1F4D78"/>
-          <w:sz w:val="18"/>
-          <w:szCs w:val="18"/>
-          <w:shd w:fill="EEF2F6" w:color="auto" w:val="clear"/>
-        </w:rPr>
-        <w:t xml:space="preserve">rightImageUrl</w:t>
-      </w:r>
-      <w:r>
-        <w:rPr>
-          <w:rFonts w:ascii="Calibri" w:cs="Calibri" w:eastAsia="Calibri" w:hAnsi="Calibri"/>
-          <w:color w:val="202124"/>
-          <w:sz w:val="20"/>
-          <w:szCs w:val="20"/>
-        </w:rPr>
-        <w:t xml:space="preserve">, </w:t>
-      </w:r>
-      <w:r>
-        <w:rPr>
-          <w:rFonts w:ascii="Courier New" w:cs="Courier New" w:eastAsia="Courier New" w:hAnsi="Courier New"/>
-          <w:color w:val="1F4D78"/>
-          <w:sz w:val="18"/>
-          <w:szCs w:val="18"/>
-          <w:shd w:fill="EEF2F6" w:color="auto" w:val="clear"/>
-        </w:rPr>
-        <w:t xml:space="preserve">videoUrl</w:t>
-      </w:r>
-      <w:r>
-        <w:rPr>
-          <w:rFonts w:ascii="Calibri" w:cs="Calibri" w:eastAsia="Calibri" w:hAnsi="Calibri"/>
-          <w:color w:val="202124"/>
-          <w:sz w:val="20"/>
-          <w:szCs w:val="20"/>
-        </w:rPr>
-        <w:t xml:space="preserve"> nhận URL công khai.</w:t>
+        <w:t xml:space="preserve">Khi import, ảnh được copy vào package và đăng ký trong session. Khi export JSON có cấu hình S3, ảnh được upload lên FPT S3; URL video/audio được giữ dưới dạng liên kết trực tuyến.</w:t>
       </w:r>
     </w:p>
     <w:p>
@@ -8458,7 +9415,69 @@
           <w:sz w:val="18"/>
           <w:szCs w:val="18"/>
         </w:rPr>
-        <w:t xml:space="preserve">~/Downloads/SNLT-CHECKQUIZ/JSON-EXPORT/{quiz_title}_teky.json</w:t>
+        <w:t xml:space="preserve">SCORM-PROJECT/JSON-EXPORT/{quiz_title}_teky.json</w:t>
+      </w:r>
+    </w:p>
+    <w:p>
+      <w:pPr>
+        <w:spacing w:after="100" w:line="280" w:lineRule="auto"/>
+      </w:pPr>
+      <w:r>
+        <w:rPr>
+          <w:rFonts w:ascii="Courier New" w:cs="Courier New" w:eastAsia="Courier New" w:hAnsi="Courier New"/>
+          <w:color w:val="1F4D78"/>
+          <w:sz w:val="18"/>
+          <w:szCs w:val="18"/>
+          <w:shd w:fill="EEF2F6" w:color="auto" w:val="clear"/>
+        </w:rPr>
+        <w:t xml:space="preserve">JSON-EXPORT</w:t>
+      </w:r>
+      <w:r>
+        <w:rPr>
+          <w:rFonts w:ascii="Calibri" w:cs="Calibri" w:eastAsia="Calibri" w:hAnsi="Calibri"/>
+          <w:color w:val="202124"/>
+          <w:sz w:val="20"/>
+          <w:szCs w:val="20"/>
+        </w:rPr>
+        <w:t xml:space="preserve"> nằm cùng cấp với </w:t>
+      </w:r>
+      <w:r>
+        <w:rPr>
+          <w:rFonts w:ascii="Courier New" w:cs="Courier New" w:eastAsia="Courier New" w:hAnsi="Courier New"/>
+          <w:color w:val="1F4D78"/>
+          <w:sz w:val="18"/>
+          <w:szCs w:val="18"/>
+          <w:shd w:fill="EEF2F6" w:color="auto" w:val="clear"/>
+        </w:rPr>
+        <w:t xml:space="preserve">ImportTemplate</w:t>
+      </w:r>
+      <w:r>
+        <w:rPr>
+          <w:rFonts w:ascii="Calibri" w:cs="Calibri" w:eastAsia="Calibri" w:hAnsi="Calibri"/>
+          <w:color w:val="202124"/>
+          <w:sz w:val="20"/>
+          <w:szCs w:val="20"/>
+        </w:rPr>
+        <w:t xml:space="preserve">. Hệ thống tự tạo thư mục này khi export lần đầu, không phụ thuộc thư mục </w:t>
+      </w:r>
+      <w:r>
+        <w:rPr>
+          <w:rFonts w:ascii="Courier New" w:cs="Courier New" w:eastAsia="Courier New" w:hAnsi="Courier New"/>
+          <w:color w:val="1F4D78"/>
+          <w:sz w:val="18"/>
+          <w:szCs w:val="18"/>
+          <w:shd w:fill="EEF2F6" w:color="auto" w:val="clear"/>
+        </w:rPr>
+        <w:t xml:space="preserve">Downloads</w:t>
+      </w:r>
+      <w:r>
+        <w:rPr>
+          <w:rFonts w:ascii="Calibri" w:cs="Calibri" w:eastAsia="Calibri" w:hAnsi="Calibri"/>
+          <w:color w:val="202124"/>
+          <w:sz w:val="20"/>
+          <w:szCs w:val="20"/>
+        </w:rPr>
+        <w:t xml:space="preserve"> của tài khoản đang chạy backend.</w:t>
       </w:r>
     </w:p>
     <w:p>

</xml_diff>